<commit_message>
Edits following second round of reviews
</commit_message>
<xml_diff>
--- a/Revisions Round 2/Response to reviewers 2_DHB.docx
+++ b/Revisions Round 2/Response to reviewers 2_DHB.docx
@@ -89,7 +89,23 @@
           <w:rFonts w:ascii="Aptos" w:hAnsi="Aptos"/>
           <w:color w:val="212121"/>
         </w:rPr>
-        <w:t>. I may be a bit picky but I still have few minor concerns:</w:t>
+        <w:t xml:space="preserve">. I may be a bit </w:t>
+      </w:r>
+      <w:proofErr w:type="gramStart"/>
+      <w:r>
+        <w:rPr>
+          <w:rFonts w:ascii="Aptos" w:hAnsi="Aptos"/>
+          <w:color w:val="212121"/>
+        </w:rPr>
+        <w:t>picky</w:t>
+      </w:r>
+      <w:proofErr w:type="gramEnd"/>
+      <w:r>
+        <w:rPr>
+          <w:rFonts w:ascii="Aptos" w:hAnsi="Aptos"/>
+          <w:color w:val="212121"/>
+        </w:rPr>
+        <w:t xml:space="preserve"> but I still have few minor concerns:</w:t>
       </w:r>
       <w:r>
         <w:rPr>
@@ -104,8 +120,65 @@
           <w:color w:val="212121"/>
         </w:rPr>
         <w:br/>
-        <w:t>I like the new fig4. However, if I understand correctly, I believe, in the last box CL and CR should be replaced by CmuL and CmuR. Or maybe in the "second stage" box RmuL should be replaced by RL ?</w:t>
-      </w:r>
+        <w:t xml:space="preserve">I like the new fig4. However, if I understand correctly, I believe, in the last box CL and CR should be replaced by </w:t>
+      </w:r>
+      <w:proofErr w:type="spellStart"/>
+      <w:r>
+        <w:rPr>
+          <w:rFonts w:ascii="Aptos" w:hAnsi="Aptos"/>
+          <w:color w:val="212121"/>
+        </w:rPr>
+        <w:t>CmuL</w:t>
+      </w:r>
+      <w:proofErr w:type="spellEnd"/>
+      <w:r>
+        <w:rPr>
+          <w:rFonts w:ascii="Aptos" w:hAnsi="Aptos"/>
+          <w:color w:val="212121"/>
+        </w:rPr>
+        <w:t xml:space="preserve"> and </w:t>
+      </w:r>
+      <w:proofErr w:type="spellStart"/>
+      <w:r>
+        <w:rPr>
+          <w:rFonts w:ascii="Aptos" w:hAnsi="Aptos"/>
+          <w:color w:val="212121"/>
+        </w:rPr>
+        <w:t>CmuR</w:t>
+      </w:r>
+      <w:proofErr w:type="spellEnd"/>
+      <w:r>
+        <w:rPr>
+          <w:rFonts w:ascii="Aptos" w:hAnsi="Aptos"/>
+          <w:color w:val="212121"/>
+        </w:rPr>
+        <w:t xml:space="preserve">. Or maybe in the "second stage" box </w:t>
+      </w:r>
+      <w:proofErr w:type="spellStart"/>
+      <w:r>
+        <w:rPr>
+          <w:rFonts w:ascii="Aptos" w:hAnsi="Aptos"/>
+          <w:color w:val="212121"/>
+        </w:rPr>
+        <w:t>RmuL</w:t>
+      </w:r>
+      <w:proofErr w:type="spellEnd"/>
+      <w:r>
+        <w:rPr>
+          <w:rFonts w:ascii="Aptos" w:hAnsi="Aptos"/>
+          <w:color w:val="212121"/>
+        </w:rPr>
+        <w:t xml:space="preserve"> should be replaced by </w:t>
+      </w:r>
+      <w:proofErr w:type="gramStart"/>
+      <w:r>
+        <w:rPr>
+          <w:rFonts w:ascii="Aptos" w:hAnsi="Aptos"/>
+          <w:color w:val="212121"/>
+        </w:rPr>
+        <w:t>RL ?</w:t>
+      </w:r>
+      <w:proofErr w:type="gramEnd"/>
       <w:r>
         <w:rPr>
           <w:rFonts w:ascii="Aptos" w:hAnsi="Aptos"/>
@@ -325,7 +398,55 @@
           <w:color w:val="212121"/>
         </w:rPr>
         <w:br/>
-        <w:t>"We agree with the reviewer, the rationale for the two types of stimulus flicker could have been clarified in the introduction. …" [ … ] "Steady-State Visually Evoked Potentials offer a unique opportunity to bridge the gap between models developed from psychophysical data and neuroimaging, as responses to stimulus contrast (i.e., SSVEP amplitude) are directly associated with behavioral sensitivity to contrast (Norcia, 2015; Wade &amp; Baker, 2025). Two common stimulus presentation protocols are used to generate SSVEPs: a sinusoidal On/Off flicker, where the stimulus alternates between a blank background (0\% contrast) and the peak contrast, and sinusoidal counterphase flicker, where the stimulus alternates in phase (i.e., the black regions become white, and the white regions become black). On/Off flicker activates different populations of on and off-cells independently once per cycle, generating frequency-following responses at the frequency of the sinusoidal modulation (1F). On/Off flicker can also generate SSVEPs at the odd and even integer harmonics (2F, 3F, 4F, etc.), which reflect nonlinear processing in the visual system (Regan, 1988). Counterphase flicker will generate two transients per cycle, resulting in SSVEPs at the even harmonics of the flicker frequency (2F, 4F, 6F, etc.). These frequency doubling responses are argued to provide a cleaner measure of nonlinear visual responses (Kim et al., 2011; Skottun, 2007). Utilizing both stimulation protocols enables a comprehensive description of linear and nonlinear visual processes, thereby generating the data necessary to evaluate psychophysical models of visual perception. "</w:t>
+        <w:t xml:space="preserve">"We agree with the reviewer, the rationale for the two types of stimulus flicker could have been clarified in the introduction. …" [ </w:t>
+      </w:r>
+      <w:proofErr w:type="gramStart"/>
+      <w:r>
+        <w:rPr>
+          <w:rFonts w:ascii="Aptos" w:hAnsi="Aptos"/>
+          <w:color w:val="212121"/>
+        </w:rPr>
+        <w:t>… ]</w:t>
+      </w:r>
+      <w:proofErr w:type="gramEnd"/>
+      <w:r>
+        <w:rPr>
+          <w:rFonts w:ascii="Aptos" w:hAnsi="Aptos"/>
+          <w:color w:val="212121"/>
+        </w:rPr>
+        <w:t xml:space="preserve"> "Steady-State Visually Evoked Potentials offer a unique opportunity to bridge the gap between models developed from psychophysical data and neuroimaging, as responses to stimulus contrast (i.e., SSVEP amplitude) are directly associated with behavioral sensitivity to contrast (Norcia, 2015; Wade &amp; Baker, 2025). Two common stimulus presentation protocols are used to generate SSVEPs: a sinusoidal </w:t>
+      </w:r>
+      <w:proofErr w:type="gramStart"/>
+      <w:r>
+        <w:rPr>
+          <w:rFonts w:ascii="Aptos" w:hAnsi="Aptos"/>
+          <w:color w:val="212121"/>
+        </w:rPr>
+        <w:t>On</w:t>
+      </w:r>
+      <w:proofErr w:type="gramEnd"/>
+      <w:r>
+        <w:rPr>
+          <w:rFonts w:ascii="Aptos" w:hAnsi="Aptos"/>
+          <w:color w:val="212121"/>
+        </w:rPr>
+        <w:t xml:space="preserve">/Off flicker, where the stimulus alternates between a blank background (0\% contrast) and the peak contrast, and sinusoidal counterphase flicker, where the stimulus alternates in phase (i.e., the black regions become white, and the white regions become black). On/Off flicker activates different populations of on and off-cells independently once per cycle, generating frequency-following responses at the frequency of the sinusoidal modulation (1F). On/Off flicker can also generate SSVEPs at the odd and even integer harmonics (2F, 3F, 4F, etc.), which reflect nonlinear processing in the visual system (Regan, 1988). Counterphase flicker will generate two transients per cycle, resulting in SSVEPs at the even harmonics of the flicker frequency (2F, 4F, 6F, etc.). These frequency doubling responses are argued to provide a cleaner measure of nonlinear visual responses (Kim et al., 2011; </w:t>
+      </w:r>
+      <w:proofErr w:type="spellStart"/>
+      <w:r>
+        <w:rPr>
+          <w:rFonts w:ascii="Aptos" w:hAnsi="Aptos"/>
+          <w:color w:val="212121"/>
+        </w:rPr>
+        <w:t>Skottun</w:t>
+      </w:r>
+      <w:proofErr w:type="spellEnd"/>
+      <w:r>
+        <w:rPr>
+          <w:rFonts w:ascii="Aptos" w:hAnsi="Aptos"/>
+          <w:color w:val="212121"/>
+        </w:rPr>
+        <w:t>, 2007). Utilizing both stimulation protocols enables a comprehensive description of linear and nonlinear visual processes, thereby generating the data necessary to evaluate psychophysical models of visual perception. "</w:t>
       </w:r>
       <w:r>
         <w:rPr>
@@ -333,7 +454,23 @@
           <w:color w:val="212121"/>
         </w:rPr>
         <w:br/>
-        <w:t>-&gt; So both protocols are designed to assess nonlinear responses?</w:t>
+        <w:t xml:space="preserve">-&gt; </w:t>
+      </w:r>
+      <w:proofErr w:type="gramStart"/>
+      <w:r>
+        <w:rPr>
+          <w:rFonts w:ascii="Aptos" w:hAnsi="Aptos"/>
+          <w:color w:val="212121"/>
+        </w:rPr>
+        <w:t>So</w:t>
+      </w:r>
+      <w:proofErr w:type="gramEnd"/>
+      <w:r>
+        <w:rPr>
+          <w:rFonts w:ascii="Aptos" w:hAnsi="Aptos"/>
+          <w:color w:val="212121"/>
+        </w:rPr>
+        <w:t xml:space="preserve"> both protocols are designed to assess nonlinear responses?</w:t>
       </w:r>
       <w:r>
         <w:rPr>
@@ -411,7 +548,23 @@
           <w:rFonts w:ascii="Aptos" w:hAnsi="Aptos"/>
           <w:color w:val="0F9ED5" w:themeColor="accent4"/>
         </w:rPr>
-        <w:t xml:space="preserve">s. However, only the On/Off stimulation protocol can generate </w:t>
+        <w:t xml:space="preserve">s. However, only the </w:t>
+      </w:r>
+      <w:proofErr w:type="gramStart"/>
+      <w:r>
+        <w:rPr>
+          <w:rFonts w:ascii="Aptos" w:hAnsi="Aptos"/>
+          <w:color w:val="0F9ED5" w:themeColor="accent4"/>
+        </w:rPr>
+        <w:t>On</w:t>
+      </w:r>
+      <w:proofErr w:type="gramEnd"/>
+      <w:r>
+        <w:rPr>
+          <w:rFonts w:ascii="Aptos" w:hAnsi="Aptos"/>
+          <w:color w:val="0F9ED5" w:themeColor="accent4"/>
+        </w:rPr>
+        <w:t xml:space="preserve">/Off stimulation protocol can generate </w:t>
       </w:r>
       <w:r>
         <w:rPr>
@@ -441,8 +594,6 @@
         </w:rPr>
         <w:t xml:space="preserve">. </w:t>
       </w:r>
-      <w:commentRangeStart w:id="0"/>
-      <w:commentRangeStart w:id="1"/>
       <w:r>
         <w:rPr>
           <w:rFonts w:ascii="Aptos" w:hAnsi="Aptos"/>
@@ -492,27 +643,53 @@
         </w:rPr>
         <w:t>.</w:t>
       </w:r>
-      <w:commentRangeEnd w:id="0"/>
-      <w:r>
-        <w:rPr>
-          <w:rStyle w:val="CommentReference"/>
-          <w:rFonts w:ascii="Aptos" w:hAnsi="Aptos"/>
-          <w:color w:val="0F9ED5" w:themeColor="accent4"/>
-          <w:sz w:val="24"/>
-          <w:szCs w:val="24"/>
-        </w:rPr>
-        <w:commentReference w:id="0"/>
-      </w:r>
-      <w:commentRangeEnd w:id="1"/>
-      <w:r>
-        <w:rPr>
-          <w:rStyle w:val="CommentReference"/>
-          <w:rFonts w:ascii="Aptos" w:hAnsi="Aptos"/>
-          <w:color w:val="0F9ED5" w:themeColor="accent4"/>
-          <w:sz w:val="24"/>
-          <w:szCs w:val="24"/>
-        </w:rPr>
-        <w:commentReference w:id="1"/>
+    </w:p>
+    <w:p>
+      <w:pPr>
+        <w:pStyle w:val="ms-outlook-mobile-reference-message"/>
+        <w:spacing w:before="0" w:beforeAutospacing="0" w:after="0" w:afterAutospacing="0"/>
+        <w:rPr>
+          <w:rFonts w:ascii="Aptos" w:hAnsi="Aptos"/>
+          <w:color w:val="0F9ED5" w:themeColor="accent4"/>
+        </w:rPr>
+      </w:pPr>
+    </w:p>
+    <w:p>
+      <w:pPr>
+        <w:pStyle w:val="ms-outlook-mobile-reference-message"/>
+        <w:spacing w:before="0" w:beforeAutospacing="0" w:after="0" w:afterAutospacing="0"/>
+        <w:rPr>
+          <w:rFonts w:ascii="Aptos" w:hAnsi="Aptos"/>
+          <w:color w:val="0F9ED5" w:themeColor="accent4"/>
+        </w:rPr>
+      </w:pPr>
+      <w:r>
+        <w:rPr>
+          <w:rFonts w:ascii="Aptos" w:hAnsi="Aptos"/>
+          <w:color w:val="0F9ED5" w:themeColor="accent4"/>
+        </w:rPr>
+        <w:t>To clarify this point, we have edited the last sentence of the SSVEP paragraph in the introduction. It now reads as:</w:t>
+      </w:r>
+      <w:r>
+        <w:rPr>
+          <w:rFonts w:ascii="Aptos" w:hAnsi="Aptos"/>
+          <w:color w:val="0F9ED5" w:themeColor="accent4"/>
+        </w:rPr>
+        <w:br/>
+      </w:r>
+      <w:r>
+        <w:rPr>
+          <w:rFonts w:ascii="Aptos" w:hAnsi="Aptos"/>
+          <w:color w:val="0F9ED5" w:themeColor="accent4"/>
+        </w:rPr>
+        <w:br/>
+      </w:r>
+      <w:r>
+        <w:rPr>
+          <w:rFonts w:ascii="Aptos" w:hAnsi="Aptos"/>
+          <w:color w:val="EE0000"/>
+        </w:rPr>
+        <w:t>Using both stimulation protocols yields the data needed for a comprehensive description of linear and nonlinear visual processes, thereby enabling evaluation of psychophysical models of visual perception.</w:t>
       </w:r>
     </w:p>
     <w:p>
@@ -630,24 +807,13 @@
         </w:rPr>
         <w:t xml:space="preserve">Steady-state Visually Evoked Potentials are </w:t>
       </w:r>
-      <w:del w:id="2" w:author="Daniel Baker" w:date="2026-03-01T10:31:00Z" w16du:dateUtc="2026-03-01T18:31:00Z">
-        <w:r>
-          <w:rPr>
-            <w:rFonts w:ascii="Aptos" w:hAnsi="Aptos"/>
-            <w:color w:val="0F9ED5" w:themeColor="accent4"/>
-          </w:rPr>
-          <w:delText>Evoked Potentials</w:delText>
-        </w:r>
-      </w:del>
-      <w:ins w:id="3" w:author="Daniel Baker" w:date="2026-03-01T10:31:00Z" w16du:dateUtc="2026-03-01T18:31:00Z">
-        <w:r>
-          <w:rPr>
-            <w:rFonts w:ascii="Aptos" w:hAnsi="Aptos"/>
-            <w:color w:val="0F9ED5" w:themeColor="accent4"/>
-          </w:rPr>
-          <w:t>neural responses</w:t>
-        </w:r>
-      </w:ins>
+      <w:r>
+        <w:rPr>
+          <w:rFonts w:ascii="Aptos" w:hAnsi="Aptos"/>
+          <w:color w:val="0F9ED5" w:themeColor="accent4"/>
+        </w:rPr>
+        <w:t>neural responses</w:t>
+      </w:r>
       <w:r>
         <w:rPr>
           <w:rFonts w:ascii="Aptos" w:hAnsi="Aptos"/>
@@ -655,15 +821,13 @@
         </w:rPr>
         <w:t xml:space="preserve"> to stimuli that are presented </w:t>
       </w:r>
-      <w:ins w:id="4" w:author="Daniel Baker" w:date="2026-03-01T10:31:00Z" w16du:dateUtc="2026-03-01T18:31:00Z">
-        <w:r>
-          <w:rPr>
-            <w:rFonts w:ascii="Aptos" w:hAnsi="Aptos"/>
-            <w:color w:val="0F9ED5" w:themeColor="accent4"/>
-          </w:rPr>
-          <w:t xml:space="preserve">periodically </w:t>
-        </w:r>
-      </w:ins>
+      <w:r>
+        <w:rPr>
+          <w:rFonts w:ascii="Aptos" w:hAnsi="Aptos"/>
+          <w:color w:val="0F9ED5" w:themeColor="accent4"/>
+        </w:rPr>
+        <w:t xml:space="preserve">periodically </w:t>
+      </w:r>
       <w:r>
         <w:rPr>
           <w:rFonts w:ascii="Aptos" w:hAnsi="Aptos"/>
@@ -848,7 +1012,43 @@
           <w:kern w:val="0"/>
           <w14:ligatures w14:val="none"/>
         </w:rPr>
-        <w:t xml:space="preserve">Norcia, A. M., Appelbaum, L. G., Ales, J. M., Cottereau, B. R., &amp; Rossion, B. (2015). The steady-state visual evoked potential in vision research: A review. </w:t>
+        <w:t xml:space="preserve">Norcia, A. M., Appelbaum, L. G., Ales, J. M., </w:t>
+      </w:r>
+      <w:proofErr w:type="spellStart"/>
+      <w:r>
+        <w:rPr>
+          <w:rFonts w:ascii="Times New Roman" w:eastAsia="Times New Roman" w:hAnsi="Times New Roman" w:cs="Times New Roman"/>
+          <w:kern w:val="0"/>
+          <w14:ligatures w14:val="none"/>
+        </w:rPr>
+        <w:t>Cottereau</w:t>
+      </w:r>
+      <w:proofErr w:type="spellEnd"/>
+      <w:r>
+        <w:rPr>
+          <w:rFonts w:ascii="Times New Roman" w:eastAsia="Times New Roman" w:hAnsi="Times New Roman" w:cs="Times New Roman"/>
+          <w:kern w:val="0"/>
+          <w14:ligatures w14:val="none"/>
+        </w:rPr>
+        <w:t xml:space="preserve">, B. R., &amp; </w:t>
+      </w:r>
+      <w:proofErr w:type="spellStart"/>
+      <w:r>
+        <w:rPr>
+          <w:rFonts w:ascii="Times New Roman" w:eastAsia="Times New Roman" w:hAnsi="Times New Roman" w:cs="Times New Roman"/>
+          <w:kern w:val="0"/>
+          <w14:ligatures w14:val="none"/>
+        </w:rPr>
+        <w:t>Rossion</w:t>
+      </w:r>
+      <w:proofErr w:type="spellEnd"/>
+      <w:r>
+        <w:rPr>
+          <w:rFonts w:ascii="Times New Roman" w:eastAsia="Times New Roman" w:hAnsi="Times New Roman" w:cs="Times New Roman"/>
+          <w:kern w:val="0"/>
+          <w14:ligatures w14:val="none"/>
+        </w:rPr>
+        <w:t xml:space="preserve">, B. (2015). The steady-state visual evoked potential in vision research: A review. </w:t>
       </w:r>
       <w:r>
         <w:rPr>
@@ -920,6 +1120,7 @@
           <w:kern w:val="0"/>
           <w14:ligatures w14:val="none"/>
         </w:rPr>
+        <w:lastRenderedPageBreak/>
         <w:t xml:space="preserve">Regan, M. P., &amp; Regan, D. (1988). A frequency domain technique for characterizing nonlinearities in biological systems. </w:t>
       </w:r>
       <w:r>
@@ -997,150 +1198,409 @@
           <w:rFonts w:ascii="Aptos" w:hAnsi="Aptos"/>
           <w:color w:val="212121"/>
         </w:rPr>
-        <w:t xml:space="preserve">." I say: citation needed. The authors continue, "It has been clear for some time now that the proposed architecture by Campbell and Green does not capture the behavioral results of binocular summation." </w:t>
-      </w:r>
-      <w:r>
-        <w:rPr>
-          <w:rFonts w:ascii="Aptos" w:hAnsi="Aptos"/>
-          <w:color w:val="212121"/>
+        <w:t>." I say: citation needed. The authors continue, "It has been clear for some time now that the proposed architecture by Campbell and Green does not capture the behavioral results of binocular summation." Again, I say: citation needed. It seems this comment, which the authors concede is correct, was nonetheless effectively dismissed by them. There seems to have been no attempt to address it in the manuscript.</w:t>
+      </w:r>
+    </w:p>
+    <w:p>
+      <w:pPr>
+        <w:pStyle w:val="ms-outlook-mobile-reference-message"/>
+        <w:spacing w:before="0" w:beforeAutospacing="0" w:after="0" w:afterAutospacing="0"/>
+        <w:rPr>
+          <w:rFonts w:ascii="Aptos" w:hAnsi="Aptos"/>
+          <w:color w:val="212121"/>
+        </w:rPr>
+      </w:pPr>
+    </w:p>
+    <w:p>
+      <w:pPr>
+        <w:pStyle w:val="ms-outlook-mobile-reference-message"/>
+        <w:spacing w:before="0" w:beforeAutospacing="0" w:after="0" w:afterAutospacing="0"/>
+        <w:rPr>
+          <w:rFonts w:ascii="Aptos" w:hAnsi="Aptos"/>
+          <w:color w:val="0F9ED5" w:themeColor="accent4"/>
+        </w:rPr>
+      </w:pPr>
+      <w:r>
+        <w:rPr>
+          <w:rFonts w:ascii="Aptos" w:hAnsi="Aptos"/>
+          <w:color w:val="0F9ED5" w:themeColor="accent4"/>
+        </w:rPr>
+        <w:t>We conceded you were correct in describing our models as implicitly limited by late noise.</w:t>
+      </w:r>
+      <w:r>
+        <w:rPr>
+          <w:rFonts w:ascii="Aptos" w:hAnsi="Aptos"/>
+          <w:color w:val="0F9ED5" w:themeColor="accent4"/>
+        </w:rPr>
+        <w:t xml:space="preserve"> We did not include citations in our previous </w:t>
+      </w:r>
+      <w:proofErr w:type="gramStart"/>
+      <w:r>
+        <w:rPr>
+          <w:rFonts w:ascii="Aptos" w:hAnsi="Aptos"/>
+          <w:color w:val="0F9ED5" w:themeColor="accent4"/>
+        </w:rPr>
+        <w:t>replies</w:t>
+      </w:r>
+      <w:r>
+        <w:rPr>
+          <w:rFonts w:ascii="Aptos" w:hAnsi="Aptos"/>
+          <w:color w:val="0F9ED5" w:themeColor="accent4"/>
+        </w:rPr>
+        <w:t>,</w:t>
+      </w:r>
+      <w:r>
+        <w:rPr>
+          <w:rFonts w:ascii="Aptos" w:hAnsi="Aptos"/>
+          <w:color w:val="0F9ED5" w:themeColor="accent4"/>
+        </w:rPr>
+        <w:t xml:space="preserve"> but</w:t>
+      </w:r>
+      <w:proofErr w:type="gramEnd"/>
+      <w:r>
+        <w:rPr>
+          <w:rFonts w:ascii="Aptos" w:hAnsi="Aptos"/>
+          <w:color w:val="0F9ED5" w:themeColor="accent4"/>
+        </w:rPr>
+        <w:t xml:space="preserve"> are happy to do so now. </w:t>
+      </w:r>
+    </w:p>
+    <w:p>
+      <w:pPr>
+        <w:pStyle w:val="ms-outlook-mobile-reference-message"/>
+        <w:spacing w:before="0" w:beforeAutospacing="0" w:after="0" w:afterAutospacing="0"/>
+        <w:rPr>
+          <w:rFonts w:ascii="Aptos" w:hAnsi="Aptos"/>
+          <w:color w:val="0F9ED5" w:themeColor="accent4"/>
+        </w:rPr>
+      </w:pPr>
+    </w:p>
+    <w:p>
+      <w:pPr>
+        <w:pStyle w:val="ms-outlook-mobile-reference-message"/>
+        <w:spacing w:before="0" w:beforeAutospacing="0" w:after="0" w:afterAutospacing="0"/>
+        <w:rPr>
+          <w:rFonts w:ascii="Aptos" w:hAnsi="Aptos"/>
+          <w:color w:val="0F9ED5" w:themeColor="accent4"/>
+        </w:rPr>
+      </w:pPr>
+      <w:r>
+        <w:rPr>
+          <w:rFonts w:ascii="Aptos" w:hAnsi="Aptos"/>
+          <w:color w:val="0F9ED5" w:themeColor="accent4"/>
+        </w:rPr>
+        <w:t xml:space="preserve">The inability of the original models to capture the </w:t>
+      </w:r>
+      <w:proofErr w:type="spellStart"/>
+      <w:r>
+        <w:rPr>
+          <w:rFonts w:ascii="Aptos" w:hAnsi="Aptos"/>
+          <w:color w:val="0F9ED5" w:themeColor="accent4"/>
+        </w:rPr>
+        <w:t>behavio</w:t>
+      </w:r>
+      <w:r>
+        <w:rPr>
+          <w:rFonts w:ascii="Aptos" w:hAnsi="Aptos"/>
+          <w:color w:val="0F9ED5" w:themeColor="accent4"/>
+        </w:rPr>
+        <w:t>u</w:t>
+      </w:r>
+      <w:r>
+        <w:rPr>
+          <w:rFonts w:ascii="Aptos" w:hAnsi="Aptos"/>
+          <w:color w:val="0F9ED5" w:themeColor="accent4"/>
+        </w:rPr>
+        <w:t>ral</w:t>
+      </w:r>
+      <w:proofErr w:type="spellEnd"/>
+      <w:r>
+        <w:rPr>
+          <w:rFonts w:ascii="Aptos" w:hAnsi="Aptos"/>
+          <w:color w:val="0F9ED5" w:themeColor="accent4"/>
+        </w:rPr>
+        <w:t xml:space="preserve"> results of binocular summation is discussed (and demonstrated) in Meese, Georgeson, and Baker (2006)</w:t>
+      </w:r>
+      <w:r>
+        <w:rPr>
+          <w:rFonts w:ascii="Aptos" w:hAnsi="Aptos"/>
+          <w:color w:val="0F9ED5" w:themeColor="accent4"/>
+        </w:rPr>
+        <w:t xml:space="preserve">. However, the limitations of the Campbell and Green description of binocular summation, whereby the model can only return sqrt(2) improvement when the noise in one eye is ignored, or that the observer is able to respond selectively to the monocular pathway in monocular trials is recognized in the original Campbell and Green (1965) manuscript and by Blake, Sloane, and Fox (1981). Many models of binocular summation today assume late noise; many of these are variants of the two-stage contrast gain control model, but others exist as well and are reviewed in Blake and Wilson (2011). </w:t>
+      </w:r>
+    </w:p>
+    <w:p>
+      <w:pPr>
+        <w:pStyle w:val="ms-outlook-mobile-reference-message"/>
+        <w:spacing w:before="0" w:beforeAutospacing="0" w:after="0" w:afterAutospacing="0"/>
+        <w:rPr>
+          <w:rFonts w:ascii="Aptos" w:hAnsi="Aptos"/>
+          <w:color w:val="0F9ED5" w:themeColor="accent4"/>
+        </w:rPr>
+      </w:pPr>
+    </w:p>
+    <w:p>
+      <w:pPr>
+        <w:pStyle w:val="ms-outlook-mobile-reference-message"/>
+        <w:spacing w:before="0" w:beforeAutospacing="0" w:after="0" w:afterAutospacing="0"/>
+        <w:rPr>
+          <w:rFonts w:ascii="Aptos" w:hAnsi="Aptos"/>
+          <w:color w:val="0F9ED5" w:themeColor="accent4"/>
+        </w:rPr>
+      </w:pPr>
+      <w:r>
+        <w:rPr>
+          <w:rFonts w:ascii="Aptos" w:hAnsi="Aptos"/>
+          <w:color w:val="0F9ED5" w:themeColor="accent4"/>
+        </w:rPr>
+        <w:t xml:space="preserve">The goal of this manuscript is to probe a well-established model of binocular summation, first introduced in 2006 by Meese et al., and the most recent version, developed in 2016 by Georgeson et al., that includes phase-selective and monocular channels, using novel SSVEP data. </w:t>
+      </w:r>
+      <w:r>
+        <w:rPr>
+          <w:rFonts w:ascii="Aptos" w:hAnsi="Aptos"/>
+          <w:color w:val="0F9ED5" w:themeColor="accent4"/>
+        </w:rPr>
+        <w:t xml:space="preserve">Our approach to probing this model was to begin with its simplest iteration and increase its complexity up to the 2016 model proposed by Georgeson. This allowed us to demonstrate the computational elements required in the two-stage contrast gain control model architecture to explain our effects. We are not arguing for a novel model of binocular summation, and as such, believe that explaining the original descriptions of binocular summation that are not relevant to our current model architecture is beyond the scope of this manuscript. </w:t>
+      </w:r>
+    </w:p>
+    <w:p>
+      <w:pPr>
+        <w:pStyle w:val="ms-outlook-mobile-reference-message"/>
+        <w:spacing w:before="0" w:beforeAutospacing="0" w:after="0" w:afterAutospacing="0"/>
+        <w:rPr>
+          <w:rFonts w:ascii="Aptos" w:hAnsi="Aptos"/>
+          <w:color w:val="0F9ED5" w:themeColor="accent4"/>
+        </w:rPr>
+      </w:pPr>
+    </w:p>
+    <w:p>
+      <w:pPr>
+        <w:pStyle w:val="ms-outlook-mobile-reference-message"/>
+        <w:spacing w:before="0" w:beforeAutospacing="0" w:after="0" w:afterAutospacing="0"/>
+        <w:rPr>
+          <w:rFonts w:ascii="Aptos" w:hAnsi="Aptos"/>
+          <w:color w:val="0F9ED5" w:themeColor="accent4"/>
+        </w:rPr>
+      </w:pPr>
+      <w:r>
+        <w:rPr>
+          <w:rFonts w:ascii="Aptos" w:hAnsi="Aptos"/>
+          <w:color w:val="0F9ED5" w:themeColor="accent4"/>
+        </w:rPr>
+        <w:t>To make this point clear, we have made the following amendments to our manuscript. In the introduction, when speaking about the computational descriptions of binocular summation we have included:</w:t>
+      </w:r>
+    </w:p>
+    <w:p>
+      <w:pPr>
+        <w:pStyle w:val="ms-outlook-mobile-reference-message"/>
+        <w:spacing w:before="0" w:beforeAutospacing="0" w:after="0" w:afterAutospacing="0"/>
+        <w:rPr>
+          <w:rFonts w:ascii="Aptos" w:hAnsi="Aptos"/>
+          <w:color w:val="212121"/>
+        </w:rPr>
+      </w:pPr>
+    </w:p>
+    <w:p>
+      <w:pPr>
+        <w:pStyle w:val="ms-outlook-mobile-reference-message"/>
+        <w:spacing w:before="0" w:beforeAutospacing="0" w:after="0" w:afterAutospacing="0"/>
+        <w:rPr>
+          <w:rFonts w:ascii="Aptos" w:hAnsi="Aptos"/>
+          <w:color w:val="EE0000"/>
+        </w:rPr>
+      </w:pPr>
+      <w:r>
+        <w:rPr>
+          <w:rFonts w:ascii="Aptos" w:hAnsi="Aptos"/>
+          <w:color w:val="EE0000"/>
+        </w:rPr>
+        <w:t>Early approaches [@CampbellGreen1965] proposed the $\</w:t>
+      </w:r>
+      <w:proofErr w:type="gramStart"/>
+      <w:r>
+        <w:rPr>
+          <w:rFonts w:ascii="Aptos" w:hAnsi="Aptos"/>
+          <w:color w:val="EE0000"/>
+        </w:rPr>
+        <w:t>sqrt{2}$</w:t>
+      </w:r>
+      <w:proofErr w:type="gramEnd"/>
+      <w:r>
+        <w:rPr>
+          <w:rFonts w:ascii="Aptos" w:hAnsi="Aptos"/>
+          <w:color w:val="EE0000"/>
+        </w:rPr>
+        <w:t xml:space="preserve"> improvement from binocular summation could be explained because the visual system integrates signal and uncorrelated noise from the monocular channels. However, it was also recognized [@CampbellGreen</w:t>
+      </w:r>
+      <w:proofErr w:type="gramStart"/>
+      <w:r>
+        <w:rPr>
+          <w:rFonts w:ascii="Aptos" w:hAnsi="Aptos"/>
+          <w:color w:val="EE0000"/>
+        </w:rPr>
+        <w:t>1965;@</w:t>
+      </w:r>
+      <w:proofErr w:type="gramEnd"/>
+      <w:r>
+        <w:rPr>
+          <w:rFonts w:ascii="Aptos" w:hAnsi="Aptos"/>
+          <w:color w:val="EE0000"/>
+        </w:rPr>
+        <w:t>BlakeSloaneFox1981] that the model can only return $</w:t>
+      </w:r>
+      <w:proofErr w:type="gramStart"/>
+      <w:r>
+        <w:rPr>
+          <w:rFonts w:ascii="Aptos" w:hAnsi="Aptos"/>
+          <w:color w:val="EE0000"/>
+        </w:rPr>
+        <w:t>sqrt{2}$</w:t>
+      </w:r>
+      <w:proofErr w:type="gramEnd"/>
+      <w:r>
+        <w:rPr>
+          <w:rFonts w:ascii="Aptos" w:hAnsi="Aptos"/>
+          <w:color w:val="EE0000"/>
+        </w:rPr>
+        <w:t xml:space="preserve"> </w:t>
+      </w:r>
+      <w:r>
+        <w:rPr>
+          <w:rFonts w:ascii="Aptos" w:hAnsi="Aptos"/>
+          <w:color w:val="EE0000"/>
         </w:rPr>
         <w:lastRenderedPageBreak/>
-        <w:t>Again, I say: citation needed. It seems this comment, which the authors concede is correct, was nonetheless effectively dismissed by them. There seems to have been no attempt to address it in the manuscript.</w:t>
-      </w:r>
-    </w:p>
-    <w:p>
-      <w:pPr>
-        <w:pStyle w:val="ms-outlook-mobile-reference-message"/>
-        <w:spacing w:before="0" w:beforeAutospacing="0" w:after="0" w:afterAutospacing="0"/>
-        <w:rPr>
-          <w:rFonts w:ascii="Aptos" w:hAnsi="Aptos"/>
-          <w:color w:val="212121"/>
-        </w:rPr>
-      </w:pPr>
-    </w:p>
-    <w:p>
-      <w:pPr>
-        <w:pStyle w:val="ms-outlook-mobile-reference-message"/>
-        <w:spacing w:before="0" w:beforeAutospacing="0" w:after="0" w:afterAutospacing="0"/>
-        <w:rPr>
-          <w:rFonts w:ascii="Aptos" w:hAnsi="Aptos"/>
-          <w:color w:val="0F9ED5" w:themeColor="accent4"/>
-        </w:rPr>
-      </w:pPr>
-      <w:r>
-        <w:rPr>
-          <w:rFonts w:ascii="Aptos" w:hAnsi="Aptos"/>
-          <w:color w:val="0F9ED5" w:themeColor="accent4"/>
-        </w:rPr>
-        <w:t>We conceded you were correct in describing our models as implicitly limited by late noise.</w:t>
-      </w:r>
-      <w:r>
-        <w:rPr>
-          <w:rFonts w:ascii="Aptos" w:hAnsi="Aptos"/>
-          <w:color w:val="0F9ED5" w:themeColor="accent4"/>
-        </w:rPr>
-        <w:t xml:space="preserve"> We did not include citations in our previous replies</w:t>
-      </w:r>
-      <w:r>
-        <w:rPr>
-          <w:rFonts w:ascii="Aptos" w:hAnsi="Aptos"/>
-          <w:color w:val="0F9ED5" w:themeColor="accent4"/>
-        </w:rPr>
-        <w:t>,</w:t>
-      </w:r>
-      <w:r>
-        <w:rPr>
-          <w:rFonts w:ascii="Aptos" w:hAnsi="Aptos"/>
-          <w:color w:val="0F9ED5" w:themeColor="accent4"/>
-        </w:rPr>
-        <w:t xml:space="preserve"> but are happy to do so now. </w:t>
-      </w:r>
-    </w:p>
-    <w:p>
-      <w:pPr>
-        <w:pStyle w:val="ms-outlook-mobile-reference-message"/>
-        <w:spacing w:before="0" w:beforeAutospacing="0" w:after="0" w:afterAutospacing="0"/>
-        <w:rPr>
-          <w:rFonts w:ascii="Aptos" w:hAnsi="Aptos"/>
-          <w:color w:val="0F9ED5" w:themeColor="accent4"/>
-        </w:rPr>
-      </w:pPr>
-    </w:p>
-    <w:p>
-      <w:pPr>
-        <w:pStyle w:val="ms-outlook-mobile-reference-message"/>
-        <w:spacing w:before="0" w:beforeAutospacing="0" w:after="0" w:afterAutospacing="0"/>
-        <w:rPr>
-          <w:rFonts w:ascii="Aptos" w:hAnsi="Aptos"/>
-          <w:color w:val="0F9ED5" w:themeColor="accent4"/>
-        </w:rPr>
-      </w:pPr>
-      <w:r>
-        <w:rPr>
-          <w:rFonts w:ascii="Aptos" w:hAnsi="Aptos"/>
-          <w:color w:val="0F9ED5" w:themeColor="accent4"/>
-        </w:rPr>
-        <w:t>The inability of the original models to capture the behavioral results of binocular summation is discussed (and demonstrated) in Meese, Georgeson, and Baker (2006)</w:t>
-      </w:r>
-      <w:r>
-        <w:rPr>
-          <w:rFonts w:ascii="Aptos" w:hAnsi="Aptos"/>
-          <w:color w:val="0F9ED5" w:themeColor="accent4"/>
-        </w:rPr>
-        <w:t xml:space="preserve">. However, the limitations of the Campbell and Green description of binocular summation, whereby the model can only return sqrt(2) improvement when the noise in one eye is ignored, or that the observer is able to respond selectively to the monocular pathway in monocular trials is recognized in the original Campbell and Green (1965) manuscript and by Blake, Sloane, and Fox (1981). Many models of binocular summation today assume late noise; many of these are variants of the two-stage contrast gain control model, but others exist as well and are reviewed in Blake and Wilson (2011). </w:t>
-      </w:r>
-    </w:p>
-    <w:p>
-      <w:pPr>
-        <w:pStyle w:val="ms-outlook-mobile-reference-message"/>
-        <w:spacing w:before="0" w:beforeAutospacing="0" w:after="0" w:afterAutospacing="0"/>
-        <w:rPr>
-          <w:rFonts w:ascii="Aptos" w:hAnsi="Aptos"/>
-          <w:color w:val="0F9ED5" w:themeColor="accent4"/>
-        </w:rPr>
-      </w:pPr>
-    </w:p>
-    <w:p>
-      <w:pPr>
-        <w:pStyle w:val="ms-outlook-mobile-reference-message"/>
-        <w:spacing w:before="0" w:beforeAutospacing="0" w:after="0" w:afterAutospacing="0"/>
-        <w:rPr>
-          <w:rFonts w:ascii="Aptos" w:hAnsi="Aptos"/>
-          <w:color w:val="0F9ED5" w:themeColor="accent4"/>
-        </w:rPr>
-      </w:pPr>
-      <w:r>
-        <w:rPr>
-          <w:rFonts w:ascii="Aptos" w:hAnsi="Aptos"/>
-          <w:color w:val="0F9ED5" w:themeColor="accent4"/>
-        </w:rPr>
-        <w:t xml:space="preserve">The goal of this manuscript is to probe a well-established model of binocular summation, first introduced in 2006 by Meese et al., and the most recent version, developed in 2016 by Georgeson et al., that includes phase-selective and monocular channels, using novel SSVEP data. </w:t>
-      </w:r>
-      <w:r>
-        <w:rPr>
-          <w:rFonts w:ascii="Aptos" w:hAnsi="Aptos"/>
-          <w:color w:val="0F9ED5" w:themeColor="accent4"/>
-        </w:rPr>
-        <w:t xml:space="preserve">Our approach to probing this model was to begin with its simplest iteration and increase its complexity up to the 2016 model proposed by Georgeson. This allowed us to demonstrate the computational elements required in the two-stage contrast gain control model architecture to explain our effects. We are not arguing for a novel model of binocular summation, and as such, believe that explaining the original descriptions of binocular summation that are not relevant to our current model architecture is beyond the scope of this manuscript. </w:t>
-      </w:r>
-      <w:commentRangeStart w:id="5"/>
-      <w:r>
-        <w:rPr>
-          <w:rFonts w:ascii="Aptos" w:hAnsi="Aptos"/>
-          <w:color w:val="0F9ED5" w:themeColor="accent4"/>
-        </w:rPr>
-        <w:t xml:space="preserve">This is why we did not address the reviewer's concern in our text. </w:t>
-      </w:r>
-      <w:commentRangeEnd w:id="5"/>
-      <w:r>
-        <w:rPr>
-          <w:rStyle w:val="CommentReference"/>
-          <w:rFonts w:ascii="Aptos" w:hAnsi="Aptos"/>
-          <w:color w:val="0F9ED5" w:themeColor="accent4"/>
-          <w:sz w:val="24"/>
-          <w:szCs w:val="24"/>
-        </w:rPr>
-        <w:commentReference w:id="5"/>
+        <w:t>improvement when the noise in one eye is ignored, or that the observer is able to respond selectively to the monocular pathway in monocular trials.</w:t>
+      </w:r>
+    </w:p>
+    <w:p>
+      <w:pPr>
+        <w:pStyle w:val="ms-outlook-mobile-reference-message"/>
+        <w:spacing w:before="0" w:beforeAutospacing="0" w:after="0" w:afterAutospacing="0"/>
+        <w:rPr>
+          <w:rFonts w:ascii="Aptos" w:hAnsi="Aptos"/>
+          <w:color w:val="212121"/>
+        </w:rPr>
+      </w:pPr>
+    </w:p>
+    <w:p>
+      <w:pPr>
+        <w:pStyle w:val="ms-outlook-mobile-reference-message"/>
+        <w:spacing w:before="0" w:beforeAutospacing="0" w:after="0" w:afterAutospacing="0"/>
+        <w:rPr>
+          <w:rFonts w:ascii="Aptos" w:hAnsi="Aptos"/>
+          <w:color w:val="00B0F0"/>
+        </w:rPr>
+      </w:pPr>
+      <w:r>
+        <w:rPr>
+          <w:rFonts w:ascii="Aptos" w:hAnsi="Aptos"/>
+          <w:color w:val="00B0F0"/>
+        </w:rPr>
+        <w:t xml:space="preserve">In the modelling section, when explaining our modelling approach, we have specified: </w:t>
+      </w:r>
+    </w:p>
+    <w:p>
+      <w:pPr>
+        <w:pStyle w:val="ms-outlook-mobile-reference-message"/>
+        <w:spacing w:before="0" w:beforeAutospacing="0" w:after="0" w:afterAutospacing="0"/>
+        <w:rPr>
+          <w:rFonts w:ascii="Aptos" w:hAnsi="Aptos"/>
+          <w:color w:val="212121"/>
+        </w:rPr>
+      </w:pPr>
+    </w:p>
+    <w:p>
+      <w:pPr>
+        <w:pStyle w:val="ms-outlook-mobile-reference-message"/>
+        <w:spacing w:before="0" w:beforeAutospacing="0" w:after="0" w:afterAutospacing="0"/>
+        <w:rPr>
+          <w:rFonts w:ascii="Aptos" w:hAnsi="Aptos"/>
+          <w:color w:val="212121"/>
+        </w:rPr>
+      </w:pPr>
+      <w:r>
+        <w:rPr>
+          <w:rFonts w:ascii="Aptos" w:hAnsi="Aptos"/>
+          <w:color w:val="212121"/>
+        </w:rPr>
+        <w:t xml:space="preserve">The perception of binocular stimulus contrast is well-explained by psychophysical models that process input contrast in two sequential contrast gain control stages interposed by binocular summation [@Meese2006; @BakerMeese2007; @BakerMeeseGeorgeson2007; @BakerMeeseHess2008; @BakerMeeseSummers2007]. This simple, yet powerful, family of models not only captures </w:t>
+      </w:r>
+      <w:proofErr w:type="spellStart"/>
+      <w:r>
+        <w:rPr>
+          <w:rFonts w:ascii="Aptos" w:hAnsi="Aptos"/>
+          <w:color w:val="212121"/>
+        </w:rPr>
+        <w:t>behavioural</w:t>
+      </w:r>
+      <w:proofErr w:type="spellEnd"/>
+      <w:r>
+        <w:rPr>
+          <w:rFonts w:ascii="Aptos" w:hAnsi="Aptos"/>
+          <w:color w:val="212121"/>
+        </w:rPr>
+        <w:t xml:space="preserve"> data well, but can also explain neural responses to binocular and dichoptic stimuli [@BakerWade2017; @Richardetal2018; @Lygo2021]. **</w:t>
+      </w:r>
+      <w:r>
+        <w:rPr>
+          <w:rFonts w:ascii="Aptos" w:hAnsi="Aptos"/>
+          <w:color w:val="EE0000"/>
+        </w:rPr>
+        <w:t>While other computational descriptions of binocular combination have been proposed [@CampbellGreen1965; @BlakeWilson2011; @DingSperling2006], the goal of this manuscript is to probe the architecture of the two-stage contrast gain control model and its subsequent variants with a rich SSVEP data set.</w:t>
+      </w:r>
+      <w:r>
+        <w:rPr>
+          <w:rFonts w:ascii="Aptos" w:hAnsi="Aptos"/>
+          <w:color w:val="212121"/>
+        </w:rPr>
+        <w:t>** Our SSVEP results show the expected pattern of binocular combination for stimuli presented at high contrast (i.e., ocularity invariance) but also intriguing effects that are likely explainable by the most recent extension of the two-stage contrast gain control model, as defined by @Georgeson2016. **</w:t>
+      </w:r>
+      <w:r>
+        <w:rPr>
+          <w:rFonts w:ascii="Aptos" w:hAnsi="Aptos"/>
+          <w:color w:val="EE0000"/>
+        </w:rPr>
+        <w:t xml:space="preserve">Our goal in this modelling section is not to argue for a novel description of binocular summation but to explore the architecture required under the two-stage contrast gain control framework, to describe our effects. </w:t>
+      </w:r>
+      <w:proofErr w:type="gramStart"/>
+      <w:r>
+        <w:rPr>
+          <w:rFonts w:ascii="Aptos" w:hAnsi="Aptos"/>
+          <w:color w:val="EE0000"/>
+        </w:rPr>
+        <w:t>Thus</w:t>
+      </w:r>
+      <w:proofErr w:type="gramEnd"/>
+      <w:r>
+        <w:rPr>
+          <w:rFonts w:ascii="Aptos" w:hAnsi="Aptos"/>
+          <w:color w:val="EE0000"/>
+        </w:rPr>
+        <w:t xml:space="preserve"> our approach is to progressively increase the complexity of the binocular combination model, beginning with a deliberately wrong model (i.e., linear combination) and building up to a multi-channel model with monocular, binocular, and phase-selective pathways like that proposed in @Georgeson2016 (@fig-</w:t>
+      </w:r>
+      <w:proofErr w:type="gramStart"/>
+      <w:r>
+        <w:rPr>
+          <w:rFonts w:ascii="Aptos" w:hAnsi="Aptos"/>
+          <w:color w:val="EE0000"/>
+        </w:rPr>
+        <w:t>modelDiagram)</w:t>
+      </w:r>
+      <w:r>
+        <w:rPr>
+          <w:rFonts w:ascii="Aptos" w:hAnsi="Aptos"/>
+          <w:color w:val="212121"/>
+        </w:rPr>
+        <w:t>*</w:t>
+      </w:r>
+      <w:proofErr w:type="gramEnd"/>
+      <w:r>
+        <w:rPr>
+          <w:rFonts w:ascii="Aptos" w:hAnsi="Aptos"/>
+          <w:color w:val="212121"/>
+        </w:rPr>
+        <w:t>*.</w:t>
       </w:r>
     </w:p>
     <w:p>
@@ -1174,7 +1634,23 @@
           <w:color w:val="212121"/>
         </w:rPr>
         <w:br/>
-        <w:t>The reply contains a 36-panel figure, which doesn't seem to address my concern. Again, I'm recommending separate analysis and modeling of signal and noise amplitudes. Each panel in Figs. 3, 5, 6, &amp; 7 currently contains 6 boxes. Each of these boxes could be replaced by two boxes: one for signal, and one for noise. The vertical axis should be logarithmic. As yet, the authors seem to have ignored my request for an explanation of the noise.</w:t>
+        <w:t xml:space="preserve">The reply contains a 36-panel figure, which doesn't seem to address my concern. Again, I'm recommending separate analysis and modeling of signal and noise amplitudes. Each panel in Figs. 3, 5, 6, &amp; 7 currently contains 6 boxes. Each of these boxes could be replaced by two boxes: one for signal, and one for noise. The vertical axis should be logarithmic. </w:t>
+      </w:r>
+      <w:proofErr w:type="gramStart"/>
+      <w:r>
+        <w:rPr>
+          <w:rFonts w:ascii="Aptos" w:hAnsi="Aptos"/>
+          <w:color w:val="212121"/>
+        </w:rPr>
+        <w:t>As yet</w:t>
+      </w:r>
+      <w:proofErr w:type="gramEnd"/>
+      <w:r>
+        <w:rPr>
+          <w:rFonts w:ascii="Aptos" w:hAnsi="Aptos"/>
+          <w:color w:val="212121"/>
+        </w:rPr>
+        <w:t>, the authors seem to have ignored my request for an explanation of the noise.</w:t>
       </w:r>
       <w:r>
         <w:rPr>
@@ -1200,24 +1676,13 @@
         </w:rPr>
         <w:t xml:space="preserve">Perhaps we misunderstood the reviewer's comment about using SNRs in our analysis. Our </w:t>
       </w:r>
-      <w:del w:id="6" w:author="Daniel Baker" w:date="2026-03-01T10:42:00Z" w16du:dateUtc="2026-03-01T18:42:00Z">
-        <w:r>
-          <w:rPr>
-            <w:rFonts w:ascii="Aptos" w:hAnsi="Aptos"/>
-            <w:color w:val="00B0F0"/>
-          </w:rPr>
-          <w:delText>“panel”</w:delText>
-        </w:r>
-      </w:del>
-      <w:ins w:id="7" w:author="Daniel Baker" w:date="2026-03-01T10:42:00Z" w16du:dateUtc="2026-03-01T18:42:00Z">
-        <w:r>
-          <w:rPr>
-            <w:rFonts w:ascii="Aptos" w:hAnsi="Aptos"/>
-            <w:color w:val="00B0F0"/>
-          </w:rPr>
-          <w:t>figure</w:t>
-        </w:r>
-      </w:ins>
+      <w:r>
+        <w:rPr>
+          <w:rFonts w:ascii="Aptos" w:hAnsi="Aptos"/>
+          <w:color w:val="00B0F0"/>
+        </w:rPr>
+        <w:t>figure</w:t>
+      </w:r>
       <w:r>
         <w:rPr>
           <w:rFonts w:ascii="Aptos" w:hAnsi="Aptos"/>
@@ -1225,24 +1690,13 @@
         </w:rPr>
         <w:t xml:space="preserve"> of 36 </w:t>
       </w:r>
-      <w:del w:id="8" w:author="Daniel Baker" w:date="2026-03-01T10:42:00Z" w16du:dateUtc="2026-03-01T18:42:00Z">
-        <w:r>
-          <w:rPr>
-            <w:rFonts w:ascii="Aptos" w:hAnsi="Aptos"/>
-            <w:color w:val="00B0F0"/>
-          </w:rPr>
-          <w:delText xml:space="preserve">figures </w:delText>
-        </w:r>
-      </w:del>
-      <w:ins w:id="9" w:author="Daniel Baker" w:date="2026-03-01T10:42:00Z" w16du:dateUtc="2026-03-01T18:42:00Z">
-        <w:r>
-          <w:rPr>
-            <w:rFonts w:ascii="Aptos" w:hAnsi="Aptos"/>
-            <w:color w:val="00B0F0"/>
-          </w:rPr>
-          <w:t xml:space="preserve">panels </w:t>
-        </w:r>
-      </w:ins>
+      <w:r>
+        <w:rPr>
+          <w:rFonts w:ascii="Aptos" w:hAnsi="Aptos"/>
+          <w:color w:val="00B0F0"/>
+        </w:rPr>
+        <w:t xml:space="preserve">panels </w:t>
+      </w:r>
       <w:r>
         <w:rPr>
           <w:rFonts w:ascii="Aptos" w:hAnsi="Aptos"/>
@@ -1262,7 +1716,42 @@
           <w:rFonts w:ascii="Aptos" w:hAnsi="Aptos"/>
           <w:color w:val="00B0F0"/>
         </w:rPr>
-        <w:t xml:space="preserve">, this would </w:t>
+        <w:t xml:space="preserve">, this would make using SNR a sensible approach in our analysis. </w:t>
+      </w:r>
+      <w:r>
+        <w:rPr>
+          <w:rFonts w:ascii="Aptos" w:hAnsi="Aptos"/>
+          <w:color w:val="00B0F0"/>
+        </w:rPr>
+        <w:t>Signal-to-noise ratios do not exclude noise from our analyses</w:t>
+      </w:r>
+      <w:r>
+        <w:rPr>
+          <w:rFonts w:ascii="Aptos" w:hAnsi="Aptos"/>
+          <w:color w:val="00B0F0"/>
+        </w:rPr>
+        <w:t>;</w:t>
+      </w:r>
+      <w:r>
+        <w:rPr>
+          <w:rFonts w:ascii="Aptos" w:hAnsi="Aptos"/>
+          <w:color w:val="00B0F0"/>
+        </w:rPr>
+        <w:t xml:space="preserve"> they normalize the response amplitude (the signal) </w:t>
+      </w:r>
+      <w:r>
+        <w:rPr>
+          <w:rFonts w:ascii="Aptos" w:hAnsi="Aptos"/>
+          <w:color w:val="00B0F0"/>
+        </w:rPr>
+        <w:t>relative to</w:t>
+      </w:r>
+      <w:r>
+        <w:rPr>
+          <w:rFonts w:ascii="Aptos" w:hAnsi="Aptos"/>
+          <w:color w:val="00B0F0"/>
+        </w:rPr>
+        <w:t xml:space="preserve"> the </w:t>
       </w:r>
       <w:r>
         <w:rPr>
@@ -1270,42 +1759,7 @@
           <w:color w:val="00B0F0"/>
         </w:rPr>
         <w:lastRenderedPageBreak/>
-        <w:t xml:space="preserve">make using SNR a sensible approach in our analysis. </w:t>
-      </w:r>
-      <w:r>
-        <w:rPr>
-          <w:rFonts w:ascii="Aptos" w:hAnsi="Aptos"/>
-          <w:color w:val="00B0F0"/>
-        </w:rPr>
-        <w:t>Signal-to-noise ratios do not exclude noise from our analyses</w:t>
-      </w:r>
-      <w:r>
-        <w:rPr>
-          <w:rFonts w:ascii="Aptos" w:hAnsi="Aptos"/>
-          <w:color w:val="00B0F0"/>
-        </w:rPr>
-        <w:t>;</w:t>
-      </w:r>
-      <w:r>
-        <w:rPr>
-          <w:rFonts w:ascii="Aptos" w:hAnsi="Aptos"/>
-          <w:color w:val="00B0F0"/>
-        </w:rPr>
-        <w:t xml:space="preserve"> they normalize the response amplitude (the signal) </w:t>
-      </w:r>
-      <w:r>
-        <w:rPr>
-          <w:rFonts w:ascii="Aptos" w:hAnsi="Aptos"/>
-          <w:color w:val="00B0F0"/>
-        </w:rPr>
-        <w:t>relative to</w:t>
-      </w:r>
-      <w:r>
-        <w:rPr>
-          <w:rFonts w:ascii="Aptos" w:hAnsi="Aptos"/>
-          <w:color w:val="00B0F0"/>
-        </w:rPr>
-        <w:t xml:space="preserve"> the noise amplitude. </w:t>
+        <w:t xml:space="preserve">noise amplitude. </w:t>
       </w:r>
       <w:r>
         <w:rPr>
@@ -1314,15 +1768,13 @@
         </w:rPr>
         <w:t>We calculate signal-to-noise ratios by dividing the response amplitude at the stimulation frequency or its integer harmonics by the 10 neighbouring bins (</w:t>
       </w:r>
-      <w:ins w:id="10" w:author="Daniel Baker" w:date="2026-03-01T10:43:00Z" w16du:dateUtc="2026-03-01T18:43:00Z">
-        <w:r>
-          <w:rPr>
-            <w:rFonts w:ascii="Aptos" w:hAnsi="Aptos"/>
-            <w:color w:val="00B0F0"/>
-          </w:rPr>
-          <w:t xml:space="preserve">i.e. </w:t>
-        </w:r>
-      </w:ins>
+      <w:r>
+        <w:rPr>
+          <w:rFonts w:ascii="Aptos" w:hAnsi="Aptos"/>
+          <w:color w:val="00B0F0"/>
+        </w:rPr>
+        <w:t xml:space="preserve">i.e. </w:t>
+      </w:r>
       <w:r>
         <w:rPr>
           <w:rFonts w:ascii="Aptos" w:hAnsi="Aptos"/>
@@ -1337,7 +1789,7 @@
         </w:rPr>
         <w:t xml:space="preserve">because the SSVEP amplitude spectrum is pink; therefore, response amplitudes at lower frequencies will be higher than those at higher frequencies solely due to noise. To compare the response amplitudes </w:t>
       </w:r>
-      <w:bookmarkStart w:id="11" w:name="OLE_LINK1"/>
+      <w:bookmarkStart w:id="0" w:name="OLE_LINK1"/>
       <w:r>
         <w:rPr>
           <w:rFonts w:ascii="Aptos" w:hAnsi="Aptos"/>
@@ -1345,7 +1797,7 @@
         </w:rPr>
         <w:t xml:space="preserve">across the fundamental frequency (3Hz) and its integer harmonics (6Hz, 9Hz, 12Hz, 15Hz, and 18Hz), </w:t>
       </w:r>
-      <w:bookmarkEnd w:id="11"/>
+      <w:bookmarkEnd w:id="0"/>
       <w:r>
         <w:rPr>
           <w:rFonts w:ascii="Aptos" w:hAnsi="Aptos"/>
@@ -1395,24 +1847,13 @@
         </w:rPr>
         <w:t xml:space="preserve"> </w:t>
       </w:r>
-      <w:del w:id="12" w:author="Daniel Baker" w:date="2026-03-01T10:43:00Z" w16du:dateUtc="2026-03-01T18:43:00Z">
-        <w:r>
-          <w:rPr>
-            <w:rFonts w:ascii="Aptos" w:hAnsi="Aptos"/>
-            <w:color w:val="00B0F0"/>
-          </w:rPr>
-          <w:delText xml:space="preserve">Given </w:delText>
-        </w:r>
-      </w:del>
-      <w:ins w:id="13" w:author="Daniel Baker" w:date="2026-03-01T10:43:00Z" w16du:dateUtc="2026-03-01T18:43:00Z">
-        <w:r>
-          <w:rPr>
-            <w:rFonts w:ascii="Aptos" w:hAnsi="Aptos"/>
-            <w:color w:val="00B0F0"/>
-          </w:rPr>
-          <w:t xml:space="preserve">Our analysis demonstrates </w:t>
-        </w:r>
-      </w:ins>
+      <w:r>
+        <w:rPr>
+          <w:rFonts w:ascii="Aptos" w:hAnsi="Aptos"/>
+          <w:color w:val="00B0F0"/>
+        </w:rPr>
+        <w:t xml:space="preserve">Our analysis demonstrates </w:t>
+      </w:r>
       <w:r>
         <w:rPr>
           <w:rFonts w:ascii="Aptos" w:hAnsi="Aptos"/>
@@ -1420,40 +1861,69 @@
         </w:rPr>
         <w:t xml:space="preserve">that there are no systematic differences in noise across our experimental conditions, </w:t>
       </w:r>
-      <w:del w:id="14" w:author="Daniel Baker" w:date="2026-03-01T10:44:00Z" w16du:dateUtc="2026-03-01T18:44:00Z">
-        <w:r>
-          <w:rPr>
-            <w:rFonts w:ascii="Aptos" w:hAnsi="Aptos"/>
-            <w:color w:val="00B0F0"/>
-          </w:rPr>
-          <w:delText>we are unsure what the reviewer would want us to</w:delText>
-        </w:r>
-        <w:r>
-          <w:rPr>
-            <w:rFonts w:ascii="Aptos" w:hAnsi="Aptos"/>
-            <w:color w:val="00B0F0"/>
-          </w:rPr>
-          <w:delText xml:space="preserve"> analyze in the noise</w:delText>
-        </w:r>
-      </w:del>
-      <w:ins w:id="15" w:author="Daniel Baker" w:date="2026-03-01T10:44:00Z" w16du:dateUtc="2026-03-01T18:44:00Z">
-        <w:r>
-          <w:rPr>
-            <w:rFonts w:ascii="Aptos" w:hAnsi="Aptos"/>
-            <w:color w:val="00B0F0"/>
-          </w:rPr>
-          <w:t xml:space="preserve">and therefore our </w:t>
-        </w:r>
-      </w:ins>
-      <w:ins w:id="16" w:author="Daniel Baker" w:date="2026-03-01T10:45:00Z" w16du:dateUtc="2026-03-01T18:45:00Z">
-        <w:r>
-          <w:rPr>
-            <w:rFonts w:ascii="Aptos" w:hAnsi="Aptos"/>
-            <w:color w:val="00B0F0"/>
-          </w:rPr>
-          <w:t>calculation of SNR does not confound the effects of signal we report</w:t>
-        </w:r>
-      </w:ins>
+      <w:r>
+        <w:rPr>
+          <w:rFonts w:ascii="Aptos" w:hAnsi="Aptos"/>
+          <w:color w:val="00B0F0"/>
+        </w:rPr>
+        <w:t>and therefore</w:t>
+      </w:r>
+      <w:r>
+        <w:rPr>
+          <w:rFonts w:ascii="Aptos" w:hAnsi="Aptos"/>
+          <w:color w:val="00B0F0"/>
+        </w:rPr>
+        <w:t>,</w:t>
+      </w:r>
+      <w:r>
+        <w:rPr>
+          <w:rFonts w:ascii="Aptos" w:hAnsi="Aptos"/>
+          <w:color w:val="00B0F0"/>
+        </w:rPr>
+        <w:t xml:space="preserve"> our </w:t>
+      </w:r>
+      <w:r>
+        <w:rPr>
+          <w:rFonts w:ascii="Aptos" w:hAnsi="Aptos"/>
+          <w:color w:val="00B0F0"/>
+        </w:rPr>
+        <w:t>SNR</w:t>
+      </w:r>
+      <w:r>
+        <w:rPr>
+          <w:rFonts w:ascii="Aptos" w:hAnsi="Aptos"/>
+          <w:color w:val="00B0F0"/>
+        </w:rPr>
+        <w:t xml:space="preserve"> </w:t>
+      </w:r>
+      <w:r>
+        <w:rPr>
+          <w:rFonts w:ascii="Aptos" w:hAnsi="Aptos"/>
+          <w:color w:val="00B0F0"/>
+        </w:rPr>
+        <w:t>calculation</w:t>
+      </w:r>
+      <w:r>
+        <w:rPr>
+          <w:rFonts w:ascii="Aptos" w:hAnsi="Aptos"/>
+          <w:color w:val="00B0F0"/>
+        </w:rPr>
+        <w:t xml:space="preserve"> does not confound the effects of </w:t>
+      </w:r>
+      <w:r>
+        <w:rPr>
+          <w:rFonts w:ascii="Aptos" w:hAnsi="Aptos"/>
+          <w:color w:val="00B0F0"/>
+        </w:rPr>
+        <w:t xml:space="preserve">the </w:t>
+      </w:r>
+      <w:r>
+        <w:rPr>
+          <w:rFonts w:ascii="Aptos" w:hAnsi="Aptos"/>
+          <w:color w:val="00B0F0"/>
+        </w:rPr>
+        <w:t>signal we report</w:t>
+      </w:r>
       <w:r>
         <w:rPr>
           <w:rFonts w:ascii="Aptos" w:hAnsi="Aptos"/>
@@ -1481,104 +1951,82 @@
           <w:color w:val="00B0F0"/>
         </w:rPr>
       </w:pPr>
-      <w:commentRangeStart w:id="17"/>
-      <w:r>
-        <w:rPr>
-          <w:rFonts w:ascii="Aptos" w:hAnsi="Aptos"/>
-          <w:color w:val="00B0F0"/>
-        </w:rPr>
-        <w:t xml:space="preserve">We are </w:t>
-      </w:r>
-      <w:r>
-        <w:rPr>
-          <w:rFonts w:ascii="Aptos" w:hAnsi="Aptos"/>
-          <w:color w:val="00B0F0"/>
-        </w:rPr>
-        <w:t xml:space="preserve">also </w:t>
-      </w:r>
-      <w:r>
-        <w:rPr>
-          <w:rFonts w:ascii="Aptos" w:hAnsi="Aptos"/>
-          <w:color w:val="00B0F0"/>
-        </w:rPr>
-        <w:t xml:space="preserve">unclear </w:t>
-      </w:r>
-      <w:r>
-        <w:rPr>
-          <w:rFonts w:ascii="Aptos" w:hAnsi="Aptos"/>
-          <w:color w:val="00B0F0"/>
-        </w:rPr>
-        <w:t xml:space="preserve">as to </w:t>
-      </w:r>
-      <w:r>
-        <w:rPr>
-          <w:rFonts w:ascii="Aptos" w:hAnsi="Aptos"/>
-          <w:color w:val="00B0F0"/>
-        </w:rPr>
-        <w:t xml:space="preserve">what the reviewer means when they ask </w:t>
-      </w:r>
-      <w:r>
-        <w:rPr>
-          <w:rFonts w:ascii="Aptos" w:hAnsi="Aptos"/>
-          <w:color w:val="00B0F0"/>
-        </w:rPr>
-        <w:t>us</w:t>
-      </w:r>
-      <w:r>
-        <w:rPr>
-          <w:rFonts w:ascii="Aptos" w:hAnsi="Aptos"/>
-          <w:color w:val="00B0F0"/>
-        </w:rPr>
-        <w:t xml:space="preserve"> </w:t>
-      </w:r>
-      <w:r>
-        <w:rPr>
-          <w:rFonts w:ascii="Aptos" w:hAnsi="Aptos"/>
-          <w:color w:val="00B0F0"/>
-        </w:rPr>
-        <w:t>to include</w:t>
-      </w:r>
-      <w:r>
-        <w:rPr>
-          <w:rFonts w:ascii="Aptos" w:hAnsi="Aptos"/>
-          <w:color w:val="00B0F0"/>
-        </w:rPr>
-        <w:t xml:space="preserve"> boxplots t</w:t>
-      </w:r>
-      <w:r>
-        <w:rPr>
-          <w:rFonts w:ascii="Aptos" w:hAnsi="Aptos"/>
-          <w:color w:val="00B0F0"/>
-        </w:rPr>
-        <w:t>hat</w:t>
-      </w:r>
-      <w:r>
-        <w:rPr>
-          <w:rFonts w:ascii="Aptos" w:hAnsi="Aptos"/>
-          <w:color w:val="00B0F0"/>
-        </w:rPr>
-        <w:t xml:space="preserve"> represent both the signal and the noise in our data</w:t>
-      </w:r>
-      <w:r>
-        <w:rPr>
-          <w:rFonts w:ascii="Aptos" w:hAnsi="Aptos"/>
-          <w:color w:val="00B0F0"/>
-        </w:rPr>
-        <w:t xml:space="preserve">, as representing signal (the response amplitude at 3Hz, for example) and noise (the average of the 10 neighbouring bins: 2.5Hz, 2.6Hz, 2.7Hz, 2.8Hz, 2.9Hz, 3.1Hz, 3.2Hz, 3.3Hz, 3.4Hz, and 3.5Hz) would only result in shifting the distribution for “signal” responses upwards for low frequency and reducing the amplitude for high frequencies (because response amplitude is dependent on the pink amplitude spectrum of SSVEPs). This would make </w:t>
-      </w:r>
-      <w:r>
-        <w:rPr>
-          <w:rFonts w:ascii="Aptos" w:hAnsi="Aptos"/>
-          <w:color w:val="00B0F0"/>
-        </w:rPr>
-        <w:t>it harder to se</w:t>
-      </w:r>
-      <w:r>
-        <w:rPr>
-          <w:rFonts w:ascii="Aptos" w:hAnsi="Aptos"/>
-          <w:color w:val="00B0F0"/>
-        </w:rPr>
-        <w:t>e differences in the magnitude</w:t>
+      <w:r>
+        <w:rPr>
+          <w:rFonts w:ascii="Aptos" w:hAnsi="Aptos"/>
+          <w:color w:val="00B0F0"/>
+        </w:rPr>
+        <w:t xml:space="preserve">We have made the figure requested by the reviewer. The y-axis is logarithmic, and </w:t>
+      </w:r>
+      <w:r>
+        <w:rPr>
+          <w:rFonts w:ascii="Aptos" w:hAnsi="Aptos"/>
+          <w:color w:val="00B0F0"/>
+        </w:rPr>
+        <w:t xml:space="preserve">the </w:t>
+      </w:r>
+      <w:r>
+        <w:rPr>
+          <w:rFonts w:ascii="Aptos" w:hAnsi="Aptos"/>
+          <w:color w:val="00B0F0"/>
+        </w:rPr>
+        <w:t>signal (amplitude at the stimulation frequency and its harmonics) is drawn in red</w:t>
+      </w:r>
+      <w:r>
+        <w:rPr>
+          <w:rFonts w:ascii="Aptos" w:hAnsi="Aptos"/>
+          <w:color w:val="00B0F0"/>
+        </w:rPr>
+        <w:t>,</w:t>
+      </w:r>
+      <w:r>
+        <w:rPr>
+          <w:rFonts w:ascii="Aptos" w:hAnsi="Aptos"/>
+          <w:color w:val="00B0F0"/>
+        </w:rPr>
+        <w:t xml:space="preserve"> with the noise (the average of the 10 neighbouring bins) for each signal is drawn in gray. </w:t>
+      </w:r>
+      <w:r>
+        <w:rPr>
+          <w:rFonts w:ascii="Aptos" w:hAnsi="Aptos"/>
+          <w:color w:val="00B0F0"/>
+        </w:rPr>
+        <w:t xml:space="preserve">The boxplots represent distributions across observers. Even on a log axis, we can clearly see that amplitude decreases with frequency, so the low frequencies have higher amplitude than the higher ones. </w:t>
+      </w:r>
+      <w:r>
+        <w:rPr>
+          <w:rFonts w:ascii="Aptos" w:hAnsi="Aptos"/>
+          <w:color w:val="00B0F0"/>
+        </w:rPr>
+        <w:t xml:space="preserve">We hope the reviewer can see from these figures that the interesting data story </w:t>
+      </w:r>
+      <w:r>
+        <w:rPr>
+          <w:rFonts w:ascii="Aptos" w:hAnsi="Aptos"/>
+          <w:color w:val="00B0F0"/>
+        </w:rPr>
+        <w:t>aris</w:t>
+      </w:r>
+      <w:r>
+        <w:rPr>
+          <w:rFonts w:ascii="Aptos" w:hAnsi="Aptos"/>
+          <w:color w:val="00B0F0"/>
+        </w:rPr>
+        <w:t xml:space="preserve">es from the relative difference between signal and noise, not </w:t>
+      </w:r>
+      <w:r>
+        <w:rPr>
+          <w:rFonts w:ascii="Aptos" w:hAnsi="Aptos"/>
+          <w:color w:val="00B0F0"/>
+        </w:rPr>
+        <w:t>from</w:t>
+      </w:r>
+      <w:r>
+        <w:rPr>
+          <w:rFonts w:ascii="Aptos" w:hAnsi="Aptos"/>
+          <w:color w:val="00B0F0"/>
+        </w:rPr>
+        <w:t xml:space="preserve"> amplitude change</w:t>
       </w:r>
       <w:r>
         <w:rPr>
@@ -1592,149 +2040,18 @@
           <w:rFonts w:ascii="Aptos" w:hAnsi="Aptos"/>
           <w:color w:val="00B0F0"/>
         </w:rPr>
-        <w:t xml:space="preserve"> of the SSVEP components</w:t>
-      </w:r>
-      <w:r>
-        <w:rPr>
-          <w:rFonts w:ascii="Aptos" w:hAnsi="Aptos"/>
-          <w:color w:val="00B0F0"/>
-        </w:rPr>
-        <w:t>,</w:t>
-      </w:r>
-      <w:r>
-        <w:rPr>
-          <w:rFonts w:ascii="Aptos" w:hAnsi="Aptos"/>
-          <w:color w:val="00B0F0"/>
-        </w:rPr>
-        <w:t xml:space="preserve"> as they have different “baseline values” and are no longer normalized</w:t>
-      </w:r>
-      <w:r>
-        <w:rPr>
-          <w:rFonts w:ascii="Aptos" w:hAnsi="Aptos"/>
-          <w:color w:val="00B0F0"/>
-        </w:rPr>
-        <w:t xml:space="preserve"> as they are as SNRs</w:t>
-      </w:r>
-      <w:r>
-        <w:rPr>
-          <w:rFonts w:ascii="Aptos" w:hAnsi="Aptos"/>
-          <w:color w:val="00B0F0"/>
-        </w:rPr>
-        <w:t xml:space="preserve">. </w:t>
-      </w:r>
-      <w:r>
-        <w:rPr>
-          <w:rFonts w:ascii="Aptos" w:hAnsi="Aptos"/>
-          <w:color w:val="00B0F0"/>
-        </w:rPr>
-        <w:t xml:space="preserve">Implementing a log transformation of the Y axis </w:t>
-      </w:r>
-      <w:r>
-        <w:rPr>
-          <w:rFonts w:ascii="Aptos" w:hAnsi="Aptos"/>
-          <w:color w:val="00B0F0"/>
-        </w:rPr>
-        <w:t xml:space="preserve">would not resolve the scaling issue, but it does transform the decrease in amplitude as a function of frequency from a power law to a linear one. </w:t>
-      </w:r>
-      <w:commentRangeEnd w:id="17"/>
-      <w:r>
-        <w:rPr>
-          <w:rStyle w:val="CommentReference"/>
-          <w:rFonts w:ascii="Aptos" w:hAnsi="Aptos"/>
-          <w:color w:val="00B0F0"/>
-          <w:sz w:val="24"/>
-          <w:szCs w:val="24"/>
-        </w:rPr>
-        <w:commentReference w:id="17"/>
-      </w:r>
-    </w:p>
-    <w:p>
-      <w:pPr>
-        <w:pStyle w:val="ms-outlook-mobile-reference-message"/>
-        <w:spacing w:before="0" w:beforeAutospacing="0" w:after="0" w:afterAutospacing="0"/>
-        <w:rPr>
-          <w:rFonts w:ascii="Aptos" w:hAnsi="Aptos"/>
-          <w:color w:val="00B0F0"/>
-        </w:rPr>
-      </w:pPr>
-    </w:p>
-    <w:p>
-      <w:pPr>
-        <w:pStyle w:val="ms-outlook-mobile-reference-message"/>
-        <w:spacing w:before="0" w:beforeAutospacing="0" w:after="0" w:afterAutospacing="0"/>
-        <w:rPr>
-          <w:rFonts w:ascii="Aptos" w:hAnsi="Aptos"/>
-          <w:color w:val="00B0F0"/>
-        </w:rPr>
-      </w:pPr>
-      <w:r>
-        <w:rPr>
-          <w:rFonts w:ascii="Aptos" w:hAnsi="Aptos"/>
-          <w:color w:val="00B0F0"/>
-        </w:rPr>
-        <w:t xml:space="preserve">We have made the figure requested by the reviewer. The y-axis is logarithmic, and </w:t>
-      </w:r>
-      <w:r>
-        <w:rPr>
-          <w:rFonts w:ascii="Aptos" w:hAnsi="Aptos"/>
-          <w:color w:val="00B0F0"/>
-        </w:rPr>
-        <w:t xml:space="preserve">the </w:t>
-      </w:r>
-      <w:r>
-        <w:rPr>
-          <w:rFonts w:ascii="Aptos" w:hAnsi="Aptos"/>
-          <w:color w:val="00B0F0"/>
-        </w:rPr>
-        <w:t>signal (amplitude at the stimulation frequency and its harmonics) is drawn in red</w:t>
-      </w:r>
-      <w:r>
-        <w:rPr>
-          <w:rFonts w:ascii="Aptos" w:hAnsi="Aptos"/>
-          <w:color w:val="00B0F0"/>
-        </w:rPr>
-        <w:t>,</w:t>
-      </w:r>
-      <w:r>
-        <w:rPr>
-          <w:rFonts w:ascii="Aptos" w:hAnsi="Aptos"/>
-          <w:color w:val="00B0F0"/>
-        </w:rPr>
-        <w:t xml:space="preserve"> with the noise (the average of the 10 neighbouring bins) for each signal is drawn in gray. </w:t>
-      </w:r>
-      <w:r>
-        <w:rPr>
-          <w:rFonts w:ascii="Aptos" w:hAnsi="Aptos"/>
-          <w:color w:val="00B0F0"/>
-        </w:rPr>
-        <w:t xml:space="preserve">The boxplots represent distributions across observers. Even on a log axis, we can clearly see that amplitude decreases with frequency, so the low frequencies have higher amplitude than the higher ones. The noise </w:t>
-      </w:r>
-      <w:commentRangeStart w:id="18"/>
-      <w:r>
-        <w:rPr>
-          <w:rFonts w:ascii="Aptos" w:hAnsi="Aptos"/>
-          <w:color w:val="00B0F0"/>
-        </w:rPr>
-        <w:t xml:space="preserve">trails </w:t>
-      </w:r>
-      <w:commentRangeEnd w:id="18"/>
-      <w:r>
-        <w:rPr>
-          <w:rStyle w:val="CommentReference"/>
-          <w:rFonts w:ascii="Aptos" w:hAnsi="Aptos"/>
-          <w:color w:val="00B0F0"/>
-          <w:sz w:val="24"/>
-          <w:szCs w:val="24"/>
-        </w:rPr>
-        <w:commentReference w:id="18"/>
-      </w:r>
-      <w:r>
-        <w:rPr>
-          <w:rFonts w:ascii="Aptos" w:hAnsi="Aptos"/>
-          <w:color w:val="00B0F0"/>
-        </w:rPr>
-        <w:t>with the signal because the amplitude spectrum is pink.</w:t>
-      </w:r>
+        <w:t xml:space="preserve"> across frequency. </w:t>
+      </w:r>
+    </w:p>
+    <w:p>
+      <w:pPr>
+        <w:pStyle w:val="ms-outlook-mobile-reference-message"/>
+        <w:spacing w:before="0" w:beforeAutospacing="0" w:after="0" w:afterAutospacing="0"/>
+        <w:rPr>
+          <w:rFonts w:ascii="Aptos" w:hAnsi="Aptos"/>
+          <w:color w:val="00B0F0"/>
+        </w:rPr>
+      </w:pPr>
     </w:p>
     <w:p>
       <w:pPr>
@@ -1768,7 +2085,7 @@
                     <pic:cNvPicPr/>
                   </pic:nvPicPr>
                   <pic:blipFill>
-                    <a:blip r:embed="rId8" cstate="print">
+                    <a:blip r:embed="rId4" cstate="print">
                       <a:extLst>
                         <a:ext uri="{28A0092B-C50C-407E-A947-70E740481C1C}">
                           <a14:useLocalDpi xmlns:a14="http://schemas.microsoft.com/office/drawing/2010/main" val="0"/>
@@ -1809,51 +2126,40 @@
           <w:rFonts w:ascii="Aptos" w:hAnsi="Aptos"/>
           <w:color w:val="00B0F0"/>
         </w:rPr>
+        <w:t xml:space="preserve">We have </w:t>
+      </w:r>
+      <w:r>
+        <w:rPr>
+          <w:rFonts w:ascii="Aptos" w:hAnsi="Aptos"/>
+          <w:color w:val="00B0F0"/>
+        </w:rPr>
+        <w:t xml:space="preserve">also </w:t>
+      </w:r>
+      <w:r>
+        <w:rPr>
+          <w:rFonts w:ascii="Aptos" w:hAnsi="Aptos"/>
+          <w:color w:val="00B0F0"/>
+        </w:rPr>
+        <w:t xml:space="preserve">made the same figure of boxplots without a log-transformed y-axis. Here we can see that the pattern is identical, but the association between amplitude and frequency follows the expected power law. </w:t>
+      </w:r>
+    </w:p>
+    <w:p>
+      <w:pPr>
+        <w:pStyle w:val="ms-outlook-mobile-reference-message"/>
+        <w:spacing w:before="0" w:beforeAutospacing="0" w:after="0" w:afterAutospacing="0"/>
+        <w:rPr>
+          <w:rFonts w:ascii="Aptos" w:hAnsi="Aptos"/>
+          <w:color w:val="00B0F0"/>
+        </w:rPr>
+      </w:pPr>
+      <w:r>
+        <w:rPr>
+          <w:rFonts w:ascii="Aptos" w:hAnsi="Aptos"/>
+          <w:noProof/>
+          <w:color w:val="00B0F0"/>
+          <w14:ligatures w14:val="standardContextual"/>
+        </w:rPr>
         <w:lastRenderedPageBreak/>
-        <w:t xml:space="preserve">We have </w:t>
-      </w:r>
-      <w:del w:id="19" w:author="Daniel Baker" w:date="2026-03-01T10:47:00Z" w16du:dateUtc="2026-03-01T18:47:00Z">
-        <w:r>
-          <w:rPr>
-            <w:rFonts w:ascii="Aptos" w:hAnsi="Aptos"/>
-            <w:color w:val="00B0F0"/>
-          </w:rPr>
-          <w:delText xml:space="preserve">almost </w:delText>
-        </w:r>
-      </w:del>
-      <w:ins w:id="20" w:author="Daniel Baker" w:date="2026-03-01T10:47:00Z" w16du:dateUtc="2026-03-01T18:47:00Z">
-        <w:r>
-          <w:rPr>
-            <w:rFonts w:ascii="Aptos" w:hAnsi="Aptos"/>
-            <w:color w:val="00B0F0"/>
-          </w:rPr>
-          <w:t xml:space="preserve">also </w:t>
-        </w:r>
-      </w:ins>
-      <w:r>
-        <w:rPr>
-          <w:rFonts w:ascii="Aptos" w:hAnsi="Aptos"/>
-          <w:color w:val="00B0F0"/>
-        </w:rPr>
-        <w:t xml:space="preserve">made the same figure of boxplots without a log-transformed y-axis. Here we can see that the pattern is identical, but the association between amplitude and frequency follows the expected power law. </w:t>
-      </w:r>
-    </w:p>
-    <w:p>
-      <w:pPr>
-        <w:pStyle w:val="ms-outlook-mobile-reference-message"/>
-        <w:spacing w:before="0" w:beforeAutospacing="0" w:after="0" w:afterAutospacing="0"/>
-        <w:rPr>
-          <w:rFonts w:ascii="Aptos" w:hAnsi="Aptos"/>
-          <w:color w:val="00B0F0"/>
-        </w:rPr>
-      </w:pPr>
-      <w:r>
-        <w:rPr>
-          <w:rFonts w:ascii="Aptos" w:hAnsi="Aptos"/>
-          <w:noProof/>
-          <w:color w:val="00B0F0"/>
-          <w14:ligatures w14:val="standardContextual"/>
-        </w:rPr>
         <w:drawing>
           <wp:inline distT="0" distB="0" distL="0" distR="0" wp14:anchorId="724630A3" wp14:editId="0A311786">
             <wp:extent cx="5943600" cy="2377440"/>
@@ -1870,7 +2176,7 @@
                     <pic:cNvPicPr/>
                   </pic:nvPicPr>
                   <pic:blipFill>
-                    <a:blip r:embed="rId9" cstate="print">
+                    <a:blip r:embed="rId5" cstate="print">
                       <a:extLst>
                         <a:ext uri="{28A0092B-C50C-407E-A947-70E740481C1C}">
                           <a14:useLocalDpi xmlns:a14="http://schemas.microsoft.com/office/drawing/2010/main" val="0"/>
@@ -1912,7 +2218,23 @@
           <w:color w:val="212121"/>
         </w:rPr>
         <w:br/>
-        <w:t>3. Accoring to Wikipedia (if there is a better reference, the authors haven't provided it) mean-squared error can be used as a surrogate for maximum likelihood when errors are normally distributed. Is that the case here? Is it even plausible?</w:t>
+        <w:t xml:space="preserve">3. </w:t>
+      </w:r>
+      <w:proofErr w:type="spellStart"/>
+      <w:r>
+        <w:rPr>
+          <w:rFonts w:ascii="Aptos" w:hAnsi="Aptos"/>
+          <w:color w:val="212121"/>
+        </w:rPr>
+        <w:t>Accoring</w:t>
+      </w:r>
+      <w:proofErr w:type="spellEnd"/>
+      <w:r>
+        <w:rPr>
+          <w:rFonts w:ascii="Aptos" w:hAnsi="Aptos"/>
+          <w:color w:val="212121"/>
+        </w:rPr>
+        <w:t xml:space="preserve"> to Wikipedia (if there is a better reference, the authors haven't provided it) mean-squared error can be used as a surrogate for maximum likelihood when errors are normally distributed. Is that the case here? Is it even plausible?</w:t>
       </w:r>
     </w:p>
     <w:p>
@@ -1969,15 +2291,13 @@
         </w:rPr>
         <w:t xml:space="preserve">within the same family (all are nested within our most complex model) </w:t>
       </w:r>
-      <w:ins w:id="21" w:author="Daniel Baker" w:date="2026-03-01T10:48:00Z" w16du:dateUtc="2026-03-01T18:48:00Z">
-        <w:r>
-          <w:rPr>
-            <w:rFonts w:ascii="Aptos" w:hAnsi="Aptos"/>
-            <w:color w:val="00B0F0"/>
-          </w:rPr>
-          <w:t xml:space="preserve">we </w:t>
-        </w:r>
-      </w:ins>
+      <w:r>
+        <w:rPr>
+          <w:rFonts w:ascii="Aptos" w:hAnsi="Aptos"/>
+          <w:color w:val="00B0F0"/>
+        </w:rPr>
+        <w:t xml:space="preserve">we </w:t>
+      </w:r>
       <w:r>
         <w:rPr>
           <w:rFonts w:ascii="Aptos" w:hAnsi="Aptos"/>
@@ -1990,7 +2310,23 @@
           <w:rFonts w:ascii="Aptos" w:hAnsi="Aptos"/>
           <w:color w:val="00B0F0"/>
         </w:rPr>
-        <w:t xml:space="preserve">and our residuals are fairly homoscedastic, we don’t believe using </w:t>
+        <w:t xml:space="preserve">and our residuals are </w:t>
+      </w:r>
+      <w:proofErr w:type="gramStart"/>
+      <w:r>
+        <w:rPr>
+          <w:rFonts w:ascii="Aptos" w:hAnsi="Aptos"/>
+          <w:color w:val="00B0F0"/>
+        </w:rPr>
+        <w:t>fairly homoscedastic</w:t>
+      </w:r>
+      <w:proofErr w:type="gramEnd"/>
+      <w:r>
+        <w:rPr>
+          <w:rFonts w:ascii="Aptos" w:hAnsi="Aptos"/>
+          <w:color w:val="00B0F0"/>
+        </w:rPr>
+        <w:t xml:space="preserve">, we don’t believe using </w:t>
       </w:r>
       <w:r>
         <w:rPr>
@@ -2057,14 +2393,83 @@
           <w:rFonts w:ascii="Aptos" w:hAnsi="Aptos"/>
           <w:color w:val="00B0F0"/>
         </w:rPr>
-        <w:t xml:space="preserve">There was no need to address a question about observer pooling for nonparametric tests (which are not subject to sample-size assumptions). Explaining why observer data is aggregated into a measure of central tendency for group comparisons is elementary statistics and does not require explanation in a manuscript. As for the potential p-hacking comment, we addressed it directly with the reviewer and explained that a sample of 15 is common in SSVEP research, and it can be much larger when small effects need to be measured. </w:t>
-      </w:r>
-      <w:r>
-        <w:rPr>
-          <w:rFonts w:ascii="Aptos" w:hAnsi="Aptos"/>
-          <w:color w:val="00B0F0"/>
-        </w:rPr>
-        <w:t>The reviewer is welcome to search the literature and see that SSVEP studies have sample sizes of at least 10, but can range up to 100. In our previous publications using SSVEPs to study binocular vision we have sampled between 9 (Richard, et al., 2018) and 19 observers (</w:t>
+        <w:t xml:space="preserve">There was no need to address a question about observer pooling for nonparametric tests (which are not subject to sample-size assumptions). Explaining why observer data is aggregated into a measure of central tendency for group comparisons is elementary statistics and does not require explanation in a manuscript. </w:t>
+      </w:r>
+    </w:p>
+    <w:p>
+      <w:pPr>
+        <w:pStyle w:val="ms-outlook-mobile-reference-message"/>
+        <w:spacing w:before="0" w:beforeAutospacing="0" w:after="0" w:afterAutospacing="0"/>
+        <w:rPr>
+          <w:rFonts w:ascii="Aptos" w:hAnsi="Aptos"/>
+          <w:color w:val="00B0F0"/>
+        </w:rPr>
+      </w:pPr>
+    </w:p>
+    <w:p>
+      <w:pPr>
+        <w:pStyle w:val="ms-outlook-mobile-reference-message"/>
+        <w:spacing w:before="0" w:beforeAutospacing="0" w:after="0" w:afterAutospacing="0"/>
+        <w:rPr>
+          <w:rFonts w:ascii="Aptos" w:hAnsi="Aptos"/>
+          <w:color w:val="00B0F0"/>
+        </w:rPr>
+      </w:pPr>
+      <w:r>
+        <w:rPr>
+          <w:rFonts w:ascii="Aptos" w:hAnsi="Aptos"/>
+          <w:color w:val="00B0F0"/>
+        </w:rPr>
+        <w:t xml:space="preserve">As for the potential p-hacking comment, we addressed it directly with the reviewer and explained that a sample of 15 is common in SSVEP research, and it can be much larger when small effects need to be measured. </w:t>
+      </w:r>
+      <w:r>
+        <w:rPr>
+          <w:rFonts w:ascii="Aptos" w:hAnsi="Aptos"/>
+          <w:color w:val="00B0F0"/>
+        </w:rPr>
+        <w:t xml:space="preserve">The reviewer is welcome to </w:t>
+      </w:r>
+      <w:r>
+        <w:rPr>
+          <w:rFonts w:ascii="Aptos" w:hAnsi="Aptos"/>
+          <w:color w:val="00B0F0"/>
+        </w:rPr>
+        <w:t>review</w:t>
+      </w:r>
+      <w:r>
+        <w:rPr>
+          <w:rFonts w:ascii="Aptos" w:hAnsi="Aptos"/>
+          <w:color w:val="00B0F0"/>
+        </w:rPr>
+        <w:t xml:space="preserve"> the literature and see that SSVEP studies have sample sizes of at least 10, </w:t>
+      </w:r>
+      <w:r>
+        <w:rPr>
+          <w:rFonts w:ascii="Aptos" w:hAnsi="Aptos"/>
+          <w:color w:val="00B0F0"/>
+        </w:rPr>
+        <w:t>though they</w:t>
+      </w:r>
+      <w:r>
+        <w:rPr>
+          <w:rFonts w:ascii="Aptos" w:hAnsi="Aptos"/>
+          <w:color w:val="00B0F0"/>
+        </w:rPr>
+        <w:t xml:space="preserve"> can range up to 100. In our previous publications using SSVEPs to study binocular vision</w:t>
+      </w:r>
+      <w:r>
+        <w:rPr>
+          <w:rFonts w:ascii="Aptos" w:hAnsi="Aptos"/>
+          <w:color w:val="00B0F0"/>
+        </w:rPr>
+        <w:t>,</w:t>
+      </w:r>
+      <w:r>
+        <w:rPr>
+          <w:rFonts w:ascii="Aptos" w:hAnsi="Aptos"/>
+          <w:color w:val="00B0F0"/>
+        </w:rPr>
+        <w:t xml:space="preserve"> we have sampled between 9 (Richard et al., 2018) and 19 observers (</w:t>
       </w:r>
       <w:r>
         <w:rPr>
@@ -2078,122 +2483,147 @@
           <w:rFonts w:ascii="Aptos" w:hAnsi="Aptos"/>
           <w:color w:val="00B0F0"/>
         </w:rPr>
-        <w:t xml:space="preserve">ote it was a total of 44, but 19 were control observers while the other were adults with amblyopia; Lygo et al., 2021). </w:t>
-      </w:r>
-      <w:ins w:id="22" w:author="Daniel Baker" w:date="2026-03-01T10:49:00Z" w16du:dateUtc="2026-03-01T18:49:00Z">
-        <w:r>
-          <w:rPr>
-            <w:rFonts w:ascii="Aptos" w:hAnsi="Aptos"/>
-            <w:color w:val="00B0F0"/>
-          </w:rPr>
-          <w:t xml:space="preserve">We also note that the data were collected in 2017, long before </w:t>
-        </w:r>
-      </w:ins>
-      <w:ins w:id="23" w:author="Daniel Baker" w:date="2026-03-01T10:50:00Z" w16du:dateUtc="2026-03-01T18:50:00Z">
-        <w:r>
-          <w:rPr>
-            <w:rFonts w:ascii="Aptos" w:hAnsi="Aptos"/>
-            <w:color w:val="00B0F0"/>
-          </w:rPr>
-          <w:t xml:space="preserve">the </w:t>
-        </w:r>
-      </w:ins>
-      <w:ins w:id="24" w:author="Daniel Baker" w:date="2026-03-01T10:49:00Z" w16du:dateUtc="2026-03-01T18:49:00Z">
-        <w:r>
-          <w:rPr>
-            <w:rFonts w:ascii="Aptos" w:hAnsi="Aptos"/>
-            <w:color w:val="00B0F0"/>
-          </w:rPr>
-          <w:t>formal a</w:t>
-        </w:r>
-      </w:ins>
-      <w:ins w:id="25" w:author="Daniel Baker" w:date="2026-03-01T10:50:00Z" w16du:dateUtc="2026-03-01T18:50:00Z">
-        <w:r>
-          <w:rPr>
-            <w:rFonts w:ascii="Aptos" w:hAnsi="Aptos"/>
-            <w:color w:val="00B0F0"/>
-          </w:rPr>
-          <w:t xml:space="preserve">nalysis and modeling reported here was </w:t>
-        </w:r>
-        <w:commentRangeStart w:id="26"/>
-        <w:r>
-          <w:rPr>
-            <w:rFonts w:ascii="Aptos" w:hAnsi="Aptos"/>
-            <w:color w:val="00B0F0"/>
-          </w:rPr>
-          <w:t>undertaken</w:t>
-        </w:r>
-        <w:commentRangeEnd w:id="26"/>
-        <w:r>
-          <w:rPr>
-            <w:rStyle w:val="CommentReference"/>
-            <w:rFonts w:ascii="Aptos" w:hAnsi="Aptos"/>
-            <w:color w:val="00B0F0"/>
-            <w:sz w:val="24"/>
-            <w:szCs w:val="24"/>
-          </w:rPr>
-          <w:commentReference w:id="26"/>
-        </w:r>
-        <w:r>
-          <w:rPr>
-            <w:rFonts w:ascii="Aptos" w:hAnsi="Aptos"/>
-            <w:color w:val="00B0F0"/>
-          </w:rPr>
-          <w:t>.</w:t>
-        </w:r>
-      </w:ins>
-    </w:p>
-    <w:p>
-      <w:pPr>
-        <w:pStyle w:val="ms-outlook-mobile-reference-message"/>
-        <w:spacing w:before="0" w:beforeAutospacing="0" w:after="0" w:afterAutospacing="0"/>
-        <w:rPr>
-          <w:rFonts w:ascii="Aptos" w:hAnsi="Aptos"/>
-          <w:color w:val="212121"/>
-        </w:rPr>
-      </w:pPr>
-      <w:r>
-        <w:rPr>
-          <w:rFonts w:ascii="Aptos" w:hAnsi="Aptos"/>
-          <w:color w:val="212121"/>
-        </w:rPr>
+        <w:t xml:space="preserve">ote </w:t>
+      </w:r>
+      <w:r>
+        <w:rPr>
+          <w:rFonts w:ascii="Aptos" w:hAnsi="Aptos"/>
+          <w:color w:val="00B0F0"/>
+        </w:rPr>
+        <w:t>that it was a total of 44, with 19 control observers and the other 25</w:t>
+      </w:r>
+      <w:r>
+        <w:rPr>
+          <w:rFonts w:ascii="Aptos" w:hAnsi="Aptos"/>
+          <w:color w:val="00B0F0"/>
+        </w:rPr>
+        <w:t xml:space="preserve"> adults with amblyopia; </w:t>
+      </w:r>
+      <w:proofErr w:type="spellStart"/>
+      <w:r>
+        <w:rPr>
+          <w:rFonts w:ascii="Aptos" w:hAnsi="Aptos"/>
+          <w:color w:val="00B0F0"/>
+        </w:rPr>
+        <w:t>Lygo</w:t>
+      </w:r>
+      <w:proofErr w:type="spellEnd"/>
+      <w:r>
+        <w:rPr>
+          <w:rFonts w:ascii="Aptos" w:hAnsi="Aptos"/>
+          <w:color w:val="00B0F0"/>
+        </w:rPr>
+        <w:t xml:space="preserve"> et al., 2021). </w:t>
+      </w:r>
+      <w:r>
+        <w:rPr>
+          <w:rFonts w:ascii="Aptos" w:hAnsi="Aptos"/>
+          <w:color w:val="00B0F0"/>
+        </w:rPr>
+        <w:t xml:space="preserve">The results and interpretations of this manuscript rely predominantly on the model, and all inferential statistics were calculated using non-parametric approaches. </w:t>
+      </w:r>
+      <w:r>
+        <w:rPr>
+          <w:rFonts w:ascii="Aptos" w:hAnsi="Aptos"/>
+          <w:color w:val="00B0F0"/>
+        </w:rPr>
+        <w:t>We also note that the data were collected in 2017, long before the formal analysis and model</w:t>
+      </w:r>
+      <w:r>
+        <w:rPr>
+          <w:rFonts w:ascii="Aptos" w:hAnsi="Aptos"/>
+          <w:color w:val="00B0F0"/>
+        </w:rPr>
+        <w:t>l</w:t>
+      </w:r>
+      <w:r>
+        <w:rPr>
+          <w:rFonts w:ascii="Aptos" w:hAnsi="Aptos"/>
+          <w:color w:val="00B0F0"/>
+        </w:rPr>
+        <w:t>ing reported here w</w:t>
+      </w:r>
+      <w:r>
+        <w:rPr>
+          <w:rFonts w:ascii="Aptos" w:hAnsi="Aptos"/>
+          <w:color w:val="00B0F0"/>
+        </w:rPr>
+        <w:t>ere</w:t>
+      </w:r>
+      <w:r>
+        <w:rPr>
+          <w:rFonts w:ascii="Aptos" w:hAnsi="Aptos"/>
+          <w:color w:val="00B0F0"/>
+        </w:rPr>
+        <w:t xml:space="preserve"> undertaken.</w:t>
+      </w:r>
+    </w:p>
+    <w:p>
+      <w:pPr>
+        <w:pStyle w:val="ms-outlook-mobile-reference-message"/>
+        <w:spacing w:before="0" w:beforeAutospacing="0" w:after="0" w:afterAutospacing="0"/>
+        <w:rPr>
+          <w:rFonts w:ascii="Aptos" w:hAnsi="Aptos"/>
+          <w:color w:val="212121"/>
+        </w:rPr>
+      </w:pPr>
+      <w:r>
+        <w:rPr>
+          <w:rFonts w:ascii="Aptos" w:hAnsi="Aptos"/>
+          <w:color w:val="212121"/>
+        </w:rPr>
+        <w:lastRenderedPageBreak/>
         <w:br/>
-        <w:t xml:space="preserve">5. An equation of this form does appear (as Eqn. 5) in Legge's 1984b paper, but a) Legge </w:t>
-      </w:r>
-      <w:r>
-        <w:rPr>
-          <w:rFonts w:ascii="Aptos" w:hAnsi="Aptos"/>
-          <w:color w:val="212121"/>
-        </w:rPr>
-        <w:lastRenderedPageBreak/>
-        <w:t>himself cites Legge and Rubin (1981) for this equation and b) the symbols represent monocular contrasts and a suprathreshold matching stimulus. They do not represent "signals from the two eyes" and an improvement in contrast sensitivity.</w:t>
-      </w:r>
-    </w:p>
-    <w:p>
-      <w:pPr>
-        <w:pStyle w:val="ms-outlook-mobile-reference-message"/>
-        <w:spacing w:before="0" w:beforeAutospacing="0" w:after="0" w:afterAutospacing="0"/>
-        <w:rPr>
-          <w:rFonts w:ascii="Aptos" w:hAnsi="Aptos"/>
-          <w:color w:val="212121"/>
-        </w:rPr>
-      </w:pPr>
-    </w:p>
-    <w:p>
-      <w:pPr>
-        <w:pStyle w:val="ms-outlook-mobile-reference-message"/>
-        <w:spacing w:before="0" w:beforeAutospacing="0" w:after="0" w:afterAutospacing="0"/>
-        <w:rPr>
-          <w:rFonts w:ascii="Aptos" w:hAnsi="Aptos"/>
-          <w:color w:val="00B0F0"/>
-        </w:rPr>
-      </w:pPr>
-      <w:r>
-        <w:rPr>
-          <w:rFonts w:ascii="Aptos" w:hAnsi="Aptos"/>
-          <w:color w:val="00B0F0"/>
-        </w:rPr>
-        <w:t>The equation presented below the Legge 1984b citation is not a direct copy of the formula in the original manuscript, but an updated interpretation of the original sqrt(Cl</w:t>
+      </w:r>
+      <w:r>
+        <w:rPr>
+          <w:rFonts w:ascii="Aptos" w:hAnsi="Aptos"/>
+          <w:color w:val="212121"/>
+        </w:rPr>
+        <w:t>5. An equation of this form does appear (as Eqn. 5) in Legge's 1984b paper, but a) Legge himself cites Legge and Rubin (1981) for this equation and b) the symbols represent monocular contrasts and a suprathreshold matching stimulus. They do not represent "signals from the two eyes" and an improvement in contrast sensitivity.</w:t>
+      </w:r>
+    </w:p>
+    <w:p>
+      <w:pPr>
+        <w:pStyle w:val="ms-outlook-mobile-reference-message"/>
+        <w:spacing w:before="0" w:beforeAutospacing="0" w:after="0" w:afterAutospacing="0"/>
+        <w:rPr>
+          <w:rFonts w:ascii="Aptos" w:hAnsi="Aptos"/>
+          <w:color w:val="212121"/>
+        </w:rPr>
+      </w:pPr>
+    </w:p>
+    <w:p>
+      <w:pPr>
+        <w:pStyle w:val="ms-outlook-mobile-reference-message"/>
+        <w:spacing w:before="0" w:beforeAutospacing="0" w:after="0" w:afterAutospacing="0"/>
+        <w:rPr>
+          <w:rFonts w:ascii="Aptos" w:hAnsi="Aptos"/>
+          <w:color w:val="00B0F0"/>
+        </w:rPr>
+      </w:pPr>
+      <w:r>
+        <w:rPr>
+          <w:rFonts w:ascii="Aptos" w:hAnsi="Aptos"/>
+          <w:color w:val="00B0F0"/>
+        </w:rPr>
+        <w:t xml:space="preserve">The equation presented below the Legge 1984b citation is not a direct copy of the formula in the original manuscript, but an updated interpretation of the original </w:t>
+      </w:r>
+      <w:proofErr w:type="gramStart"/>
+      <w:r>
+        <w:rPr>
+          <w:rFonts w:ascii="Aptos" w:hAnsi="Aptos"/>
+          <w:color w:val="00B0F0"/>
+        </w:rPr>
+        <w:t>sqrt(</w:t>
+      </w:r>
+      <w:proofErr w:type="gramEnd"/>
+      <w:r>
+        <w:rPr>
+          <w:rFonts w:ascii="Aptos" w:hAnsi="Aptos"/>
+          <w:color w:val="00B0F0"/>
+        </w:rPr>
+        <w:t>Cl</w:t>
       </w:r>
       <w:r>
         <w:rPr>
@@ -2250,7 +2680,14 @@
           <w:rFonts w:ascii="Aptos" w:hAnsi="Aptos"/>
           <w:color w:val="00B0F0"/>
         </w:rPr>
-        <w:t xml:space="preserve">Specifically, the citation refers to the following statement: </w:t>
+        <w:t xml:space="preserve">Specifically, the citation refers to the </w:t>
+      </w:r>
+      <w:r>
+        <w:rPr>
+          <w:rFonts w:ascii="Aptos" w:hAnsi="Aptos"/>
+          <w:color w:val="00B0F0"/>
+        </w:rPr>
+        <w:t xml:space="preserve">following statement: </w:t>
       </w:r>
       <w:r>
         <w:rPr>
@@ -2259,143 +2696,96 @@
         </w:rPr>
         <w:t xml:space="preserve">the binocular improvement in sensitivity </w:t>
       </w:r>
-      <w:ins w:id="27" w:author="Daniel Baker" w:date="2026-03-01T10:40:00Z" w16du:dateUtc="2026-03-01T18:40:00Z">
-        <w:r>
-          <w:rPr>
-            <w:rFonts w:ascii="Aptos" w:hAnsi="Aptos"/>
-            <w:color w:val="EE0000"/>
-          </w:rPr>
-          <w:t>(</w:t>
-        </w:r>
-      </w:ins>
-      <w:del w:id="28" w:author="Daniel Baker" w:date="2026-03-01T10:40:00Z" w16du:dateUtc="2026-03-01T18:40:00Z">
-        <w:r>
-          <w:rPr>
-            <w:rFonts w:ascii="Aptos" w:hAnsi="Aptos"/>
-            <w:color w:val="EE0000"/>
-          </w:rPr>
-          <w:delText>[@</w:delText>
-        </w:r>
-      </w:del>
       <w:r>
         <w:rPr>
           <w:rFonts w:ascii="Aptos" w:hAnsi="Aptos"/>
           <w:color w:val="EE0000"/>
         </w:rPr>
+        <w:t>(</w:t>
+      </w:r>
+      <w:r>
+        <w:rPr>
+          <w:rFonts w:ascii="Aptos" w:hAnsi="Aptos"/>
+          <w:color w:val="EE0000"/>
+        </w:rPr>
         <w:t>Legge</w:t>
       </w:r>
-      <w:ins w:id="29" w:author="Daniel Baker" w:date="2026-03-01T10:40:00Z" w16du:dateUtc="2026-03-01T18:40:00Z">
-        <w:r>
-          <w:rPr>
-            <w:rFonts w:ascii="Aptos" w:hAnsi="Aptos"/>
-            <w:color w:val="EE0000"/>
-          </w:rPr>
-          <w:t xml:space="preserve">, </w:t>
-        </w:r>
-      </w:ins>
       <w:r>
         <w:rPr>
           <w:rFonts w:ascii="Aptos" w:hAnsi="Aptos"/>
           <w:color w:val="EE0000"/>
         </w:rPr>
+        <w:t xml:space="preserve">, </w:t>
+      </w:r>
+      <w:r>
+        <w:rPr>
+          <w:rFonts w:ascii="Aptos" w:hAnsi="Aptos"/>
+          <w:color w:val="EE0000"/>
+        </w:rPr>
         <w:t>1984b</w:t>
       </w:r>
-      <w:ins w:id="30" w:author="Daniel Baker" w:date="2026-03-01T10:40:00Z" w16du:dateUtc="2026-03-01T18:40:00Z">
-        <w:r>
-          <w:rPr>
-            <w:rFonts w:ascii="Aptos" w:hAnsi="Aptos"/>
-            <w:color w:val="EE0000"/>
-          </w:rPr>
-          <w:t xml:space="preserve">) </w:t>
-        </w:r>
-      </w:ins>
-      <w:del w:id="31" w:author="Daniel Baker" w:date="2026-03-01T10:40:00Z" w16du:dateUtc="2026-03-01T18:40:00Z">
-        <w:r>
-          <w:rPr>
-            <w:rFonts w:ascii="Aptos" w:hAnsi="Aptos"/>
-            <w:color w:val="EE0000"/>
-          </w:rPr>
-          <w:delText xml:space="preserve">] </w:delText>
-        </w:r>
-      </w:del>
       <w:r>
         <w:rPr>
           <w:rFonts w:ascii="Aptos" w:hAnsi="Aptos"/>
           <w:color w:val="EE0000"/>
         </w:rPr>
+        <w:t xml:space="preserve">) </w:t>
+      </w:r>
+      <w:r>
+        <w:rPr>
+          <w:rFonts w:ascii="Aptos" w:hAnsi="Aptos"/>
+          <w:color w:val="EE0000"/>
+        </w:rPr>
         <w:t>is consistent with a non-linearity operating before the signals from the two eyes (</w:t>
       </w:r>
-      <w:ins w:id="32" w:author="Daniel Baker" w:date="2026-03-01T10:39:00Z" w16du:dateUtc="2026-03-01T18:39:00Z">
-        <w:r>
-          <w:rPr>
-            <w:rFonts w:ascii="Aptos" w:hAnsi="Aptos"/>
-            <w:color w:val="EE0000"/>
-          </w:rPr>
-          <w:t>c</w:t>
-        </w:r>
-        <w:r>
-          <w:rPr>
-            <w:rFonts w:ascii="Aptos" w:hAnsi="Aptos"/>
-            <w:color w:val="EE0000"/>
-            <w:vertAlign w:val="subscript"/>
-            <w:rPrChange w:id="33" w:author="Daniel Baker" w:date="2026-03-01T10:40:00Z" w16du:dateUtc="2026-03-01T18:40:00Z">
-              <w:rPr>
-                <w:rFonts w:ascii="Aptos" w:hAnsi="Aptos"/>
-                <w:color w:val="EE0000"/>
-              </w:rPr>
-            </w:rPrChange>
-          </w:rPr>
-          <w:t>L</w:t>
-        </w:r>
-      </w:ins>
-      <w:del w:id="34" w:author="Daniel Baker" w:date="2026-03-01T10:40:00Z" w16du:dateUtc="2026-03-01T18:40:00Z">
-        <w:r>
-          <w:rPr>
-            <w:rFonts w:ascii="Aptos" w:hAnsi="Aptos"/>
-            <w:color w:val="EE0000"/>
-          </w:rPr>
-          <w:delText xml:space="preserve">$c_L$ </w:delText>
-        </w:r>
-      </w:del>
+      <w:proofErr w:type="spellStart"/>
       <w:r>
         <w:rPr>
           <w:rFonts w:ascii="Aptos" w:hAnsi="Aptos"/>
           <w:color w:val="EE0000"/>
         </w:rPr>
-        <w:t xml:space="preserve">and </w:t>
-      </w:r>
-      <w:ins w:id="35" w:author="Daniel Baker" w:date="2026-03-01T10:40:00Z" w16du:dateUtc="2026-03-01T18:40:00Z">
-        <w:r>
-          <w:rPr>
-            <w:rFonts w:ascii="Aptos" w:hAnsi="Aptos"/>
-            <w:color w:val="EE0000"/>
-          </w:rPr>
-          <w:t>c</w:t>
-        </w:r>
-        <w:r>
-          <w:rPr>
-            <w:rFonts w:ascii="Aptos" w:hAnsi="Aptos"/>
-            <w:color w:val="EE0000"/>
-            <w:vertAlign w:val="subscript"/>
-            <w:rPrChange w:id="36" w:author="Daniel Baker" w:date="2026-03-01T10:40:00Z" w16du:dateUtc="2026-03-01T18:40:00Z">
-              <w:rPr>
-                <w:rFonts w:ascii="Aptos" w:hAnsi="Aptos"/>
-                <w:color w:val="EE0000"/>
-              </w:rPr>
-            </w:rPrChange>
-          </w:rPr>
-          <w:t>R</w:t>
-        </w:r>
-      </w:ins>
-      <w:del w:id="37" w:author="Daniel Baker" w:date="2026-03-01T10:40:00Z" w16du:dateUtc="2026-03-01T18:40:00Z">
-        <w:r>
-          <w:rPr>
-            <w:rFonts w:ascii="Aptos" w:hAnsi="Aptos"/>
-            <w:color w:val="EE0000"/>
-          </w:rPr>
-          <w:delText>$c_R$</w:delText>
-        </w:r>
-      </w:del>
+        <w:t>c</w:t>
+      </w:r>
+      <w:r>
+        <w:rPr>
+          <w:rFonts w:ascii="Aptos" w:hAnsi="Aptos"/>
+          <w:color w:val="EE0000"/>
+          <w:vertAlign w:val="subscript"/>
+        </w:rPr>
+        <w:t>L</w:t>
+      </w:r>
+      <w:r>
+        <w:rPr>
+          <w:rFonts w:ascii="Aptos" w:hAnsi="Aptos"/>
+          <w:color w:val="EE0000"/>
+        </w:rPr>
+        <w:t>and</w:t>
+      </w:r>
+      <w:proofErr w:type="spellEnd"/>
+      <w:r>
+        <w:rPr>
+          <w:rFonts w:ascii="Aptos" w:hAnsi="Aptos"/>
+          <w:color w:val="EE0000"/>
+        </w:rPr>
+        <w:t xml:space="preserve"> </w:t>
+      </w:r>
+      <w:proofErr w:type="spellStart"/>
+      <w:r>
+        <w:rPr>
+          <w:rFonts w:ascii="Aptos" w:hAnsi="Aptos"/>
+          <w:color w:val="EE0000"/>
+        </w:rPr>
+        <w:t>c</w:t>
+      </w:r>
+      <w:r>
+        <w:rPr>
+          <w:rFonts w:ascii="Aptos" w:hAnsi="Aptos"/>
+          <w:color w:val="EE0000"/>
+          <w:vertAlign w:val="subscript"/>
+        </w:rPr>
+        <w:t>R</w:t>
+      </w:r>
+      <w:proofErr w:type="spellEnd"/>
       <w:r>
         <w:rPr>
           <w:rFonts w:ascii="Aptos" w:hAnsi="Aptos"/>
@@ -2501,19 +2891,9 @@
         </w:rPr>
         <w:t xml:space="preserve">Contrast sensitivity improves by a factor of at least </w:t>
       </w:r>
-      <w:ins w:id="38" w:author="Daniel Baker" w:date="2026-03-01T10:39:00Z" w16du:dateUtc="2026-03-01T18:39:00Z">
-        <w:r>
-          <w:t xml:space="preserve">√2 </w:t>
-        </w:r>
-      </w:ins>
-      <w:del w:id="39" w:author="Daniel Baker" w:date="2026-03-01T10:39:00Z" w16du:dateUtc="2026-03-01T18:39:00Z">
-        <w:r>
-          <w:rPr>
-            <w:color w:val="EE0000"/>
-          </w:rPr>
-          <w:delText xml:space="preserve">$\sqrt{2}$ </w:delText>
-        </w:r>
-      </w:del>
+      <w:r>
+        <w:t xml:space="preserve">√2 </w:t>
+      </w:r>
       <w:r>
         <w:rPr>
           <w:color w:val="EE0000"/>
@@ -2535,152 +2915,6 @@
     </w:sectPr>
   </w:body>
 </w:document>
-</file>
-
-<file path=word/comments.xml><?xml version="1.0" encoding="utf-8"?>
-<w:comments xmlns:wpc="http://schemas.microsoft.com/office/word/2010/wordprocessingCanvas" xmlns:cx="http://schemas.microsoft.com/office/drawing/2014/chartex" xmlns:cx1="http://schemas.microsoft.com/office/drawing/2015/9/8/chartex" xmlns:cx2="http://schemas.microsoft.com/office/drawing/2015/10/21/chartex" xmlns:cx3="http://schemas.microsoft.com/office/drawing/2016/5/9/chartex" xmlns:cx4="http://schemas.microsoft.com/office/drawing/2016/5/10/chartex" xmlns:cx5="http://schemas.microsoft.com/office/drawing/2016/5/11/chartex" xmlns:cx6="http://schemas.microsoft.com/office/drawing/2016/5/12/chartex" xmlns:cx7="http://schemas.microsoft.com/office/drawing/2016/5/13/chartex" xmlns:cx8="http://schemas.microsoft.com/office/drawing/2016/5/14/chartex" xmlns:mc="http://schemas.openxmlformats.org/markup-compatibility/2006" xmlns:aink="http://schemas.microsoft.com/office/drawing/2016/ink" xmlns:am3d="http://schemas.microsoft.com/office/drawing/2017/model3d" xmlns:o="urn:schemas-microsoft-com:office:office" xmlns:oel="http://schemas.microsoft.com/office/2019/extlst" xmlns:r="http://schemas.openxmlformats.org/officeDocument/2006/relationships" xmlns:m="http://schemas.openxmlformats.org/officeDocument/2006/math" xmlns:v="urn:schemas-microsoft-com:vml" xmlns:wp14="http://schemas.microsoft.com/office/word/2010/wordprocessingDrawing" xmlns:wp="http://schemas.openxmlformats.org/drawingml/2006/wordprocessingDrawing" xmlns:w10="urn:schemas-microsoft-com:office:word" xmlns:w="http://schemas.openxmlformats.org/wordprocessingml/2006/main" xmlns:w14="http://schemas.microsoft.com/office/word/2010/wordml" xmlns:w15="http://schemas.microsoft.com/office/word/2012/wordml" xmlns:w16cex="http://schemas.microsoft.com/office/word/2018/wordml/cex" xmlns:w16cid="http://schemas.microsoft.com/office/word/2016/wordml/cid" xmlns:w16="http://schemas.microsoft.com/office/word/2018/wordml" xmlns:w16du="http://schemas.microsoft.com/office/word/2023/wordml/word16du" xmlns:w16sdtdh="http://schemas.microsoft.com/office/word/2020/wordml/sdtdatahash" xmlns:w16sdtfl="http://schemas.microsoft.com/office/word/2024/wordml/sdtformatlock" xmlns:w16se="http://schemas.microsoft.com/office/word/2015/wordml/symex" xmlns:wpg="http://schemas.microsoft.com/office/word/2010/wordprocessingGroup" xmlns:wpi="http://schemas.microsoft.com/office/word/2010/wordprocessingInk" xmlns:wne="http://schemas.microsoft.com/office/word/2006/wordml" xmlns:wps="http://schemas.microsoft.com/office/word/2010/wordprocessingShape" mc:Ignorable="w14 w15 w16se w16cid w16 w16cex w16sdtdh w16sdtfl w16du wp14">
-  <w:comment w:id="0" w:author="Daniel Baker" w:date="2026-03-01T10:30:00Z" w:initials="DB">
-    <w:p>
-      <w:pPr>
-        <w:pStyle w:val="CommentText"/>
-      </w:pPr>
-      <w:r>
-        <w:rPr>
-          <w:rStyle w:val="CommentReference"/>
-        </w:rPr>
-        <w:annotationRef/>
-      </w:r>
-      <w:r>
-        <w:t>Worth adding this to the manuscript?</w:t>
-      </w:r>
-    </w:p>
-  </w:comment>
-  <w:comment w:id="1" w:author="Bruno Richard" w:date="2026-03-02T16:01:00Z" w:initials="BR">
-    <w:p>
-      <w:r>
-        <w:rPr>
-          <w:rStyle w:val="CommentReference"/>
-        </w:rPr>
-        <w:annotationRef/>
-      </w:r>
-      <w:r>
-        <w:rPr>
-          <w:sz w:val="20"/>
-          <w:szCs w:val="20"/>
-        </w:rPr>
-        <w:t>Yes</w:t>
-      </w:r>
-    </w:p>
-  </w:comment>
-  <w:comment w:id="5" w:author="Daniel Baker" w:date="2026-03-01T10:36:00Z" w:initials="DB">
-    <w:p>
-      <w:pPr>
-        <w:pStyle w:val="CommentText"/>
-      </w:pPr>
-      <w:r>
-        <w:rPr>
-          <w:rStyle w:val="CommentReference"/>
-        </w:rPr>
-        <w:annotationRef/>
-      </w:r>
-      <w:r>
-        <w:t>I think this will piss them off. Why not include a paragraph somewhere making these points?</w:t>
-      </w:r>
-    </w:p>
-  </w:comment>
-  <w:comment w:id="17" w:author="Daniel Baker" w:date="2026-03-01T10:47:00Z" w:initials="DB">
-    <w:p>
-      <w:pPr>
-        <w:pStyle w:val="CommentText"/>
-      </w:pPr>
-      <w:r>
-        <w:rPr>
-          <w:rStyle w:val="CommentReference"/>
-        </w:rPr>
-        <w:annotationRef/>
-      </w:r>
-      <w:r>
-        <w:t>Maybe drop this paragraph. We go ahead and make the plots in the next section anyway</w:t>
-      </w:r>
-    </w:p>
-  </w:comment>
-  <w:comment w:id="18" w:author="Daniel Baker" w:date="2026-03-01T10:47:00Z" w:initials="DB">
-    <w:p>
-      <w:pPr>
-        <w:pStyle w:val="CommentText"/>
-      </w:pPr>
-      <w:r>
-        <w:rPr>
-          <w:rStyle w:val="CommentReference"/>
-        </w:rPr>
-        <w:annotationRef/>
-      </w:r>
-      <w:r>
-        <w:t>Not sure I know what this means. Do we need this sentence?</w:t>
-      </w:r>
-    </w:p>
-  </w:comment>
-  <w:comment w:id="26" w:author="Daniel Baker" w:date="2026-03-01T10:50:00Z" w:initials="DB">
-    <w:p>
-      <w:pPr>
-        <w:pStyle w:val="CommentText"/>
-      </w:pPr>
-      <w:r>
-        <w:rPr>
-          <w:rStyle w:val="CommentReference"/>
-        </w:rPr>
-        <w:annotationRef/>
-      </w:r>
-      <w:r>
-        <w:t>We could also point out that our conclusions rest more on modeling than on inferential statistics, so p-hacking is not really an issue</w:t>
-      </w:r>
-    </w:p>
-  </w:comment>
-</w:comments>
-</file>
-
-<file path=word/commentsExtended.xml><?xml version="1.0" encoding="utf-8"?>
-<w15:commentsEx xmlns:wpc="http://schemas.microsoft.com/office/word/2010/wordprocessingCanvas" xmlns:cx="http://schemas.microsoft.com/office/drawing/2014/chartex" xmlns:cx1="http://schemas.microsoft.com/office/drawing/2015/9/8/chartex" xmlns:cx2="http://schemas.microsoft.com/office/drawing/2015/10/21/chartex" xmlns:cx3="http://schemas.microsoft.com/office/drawing/2016/5/9/chartex" xmlns:cx4="http://schemas.microsoft.com/office/drawing/2016/5/10/chartex" xmlns:cx5="http://schemas.microsoft.com/office/drawing/2016/5/11/chartex" xmlns:cx6="http://schemas.microsoft.com/office/drawing/2016/5/12/chartex" xmlns:cx7="http://schemas.microsoft.com/office/drawing/2016/5/13/chartex" xmlns:cx8="http://schemas.microsoft.com/office/drawing/2016/5/14/chartex" xmlns:mc="http://schemas.openxmlformats.org/markup-compatibility/2006" xmlns:aink="http://schemas.microsoft.com/office/drawing/2016/ink" xmlns:am3d="http://schemas.microsoft.com/office/drawing/2017/model3d" xmlns:o="urn:schemas-microsoft-com:office:office" xmlns:oel="http://schemas.microsoft.com/office/2019/extlst" xmlns:r="http://schemas.openxmlformats.org/officeDocument/2006/relationships" xmlns:m="http://schemas.openxmlformats.org/officeDocument/2006/math" xmlns:v="urn:schemas-microsoft-com:vml" xmlns:wp14="http://schemas.microsoft.com/office/word/2010/wordprocessingDrawing" xmlns:wp="http://schemas.openxmlformats.org/drawingml/2006/wordprocessingDrawing" xmlns:w10="urn:schemas-microsoft-com:office:word" xmlns:w="http://schemas.openxmlformats.org/wordprocessingml/2006/main" xmlns:w14="http://schemas.microsoft.com/office/word/2010/wordml" xmlns:w15="http://schemas.microsoft.com/office/word/2012/wordml" xmlns:w16cex="http://schemas.microsoft.com/office/word/2018/wordml/cex" xmlns:w16cid="http://schemas.microsoft.com/office/word/2016/wordml/cid" xmlns:w16="http://schemas.microsoft.com/office/word/2018/wordml" xmlns:w16du="http://schemas.microsoft.com/office/word/2023/wordml/word16du" xmlns:w16sdtdh="http://schemas.microsoft.com/office/word/2020/wordml/sdtdatahash" xmlns:w16sdtfl="http://schemas.microsoft.com/office/word/2024/wordml/sdtformatlock" xmlns:w16se="http://schemas.microsoft.com/office/word/2015/wordml/symex" xmlns:wpg="http://schemas.microsoft.com/office/word/2010/wordprocessingGroup" xmlns:wpi="http://schemas.microsoft.com/office/word/2010/wordprocessingInk" xmlns:wne="http://schemas.microsoft.com/office/word/2006/wordml" xmlns:wps="http://schemas.microsoft.com/office/word/2010/wordprocessingShape" mc:Ignorable="w14 w15 w16se w16cid w16 w16cex w16sdtdh w16sdtfl w16du wp14">
-  <w15:commentEx w15:paraId="1A1E0A7F" w15:done="0"/>
-  <w15:commentEx w15:paraId="03991202" w15:paraIdParent="1A1E0A7F" w15:done="0"/>
-  <w15:commentEx w15:paraId="2622A8B1" w15:done="0"/>
-  <w15:commentEx w15:paraId="561FD940" w15:done="0"/>
-  <w15:commentEx w15:paraId="457B1378" w15:done="0"/>
-  <w15:commentEx w15:paraId="4A5F42FA" w15:done="0"/>
-</w15:commentsEx>
-</file>
-
-<file path=word/commentsExtensible.xml><?xml version="1.0" encoding="utf-8"?>
-<w16cex:commentsExtensible xmlns:wpc="http://schemas.microsoft.com/office/word/2010/wordprocessingCanvas" xmlns:cx="http://schemas.microsoft.com/office/drawing/2014/chartex" xmlns:cx1="http://schemas.microsoft.com/office/drawing/2015/9/8/chartex" xmlns:cx2="http://schemas.microsoft.com/office/drawing/2015/10/21/chartex" xmlns:cx3="http://schemas.microsoft.com/office/drawing/2016/5/9/chartex" xmlns:cx4="http://schemas.microsoft.com/office/drawing/2016/5/10/chartex" xmlns:cx5="http://schemas.microsoft.com/office/drawing/2016/5/11/chartex" xmlns:cx6="http://schemas.microsoft.com/office/drawing/2016/5/12/chartex" xmlns:cx7="http://schemas.microsoft.com/office/drawing/2016/5/13/chartex" xmlns:cx8="http://schemas.microsoft.com/office/drawing/2016/5/14/chartex" xmlns:cr="http://schemas.microsoft.com/office/comments/2020/reactions" xmlns:mc="http://schemas.openxmlformats.org/markup-compatibility/2006" xmlns:aink="http://schemas.microsoft.com/office/drawing/2016/ink" xmlns:am3d="http://schemas.microsoft.com/office/drawing/2017/model3d" xmlns:o="urn:schemas-microsoft-com:office:office" xmlns:oel="http://schemas.microsoft.com/office/2019/extlst" xmlns:r="http://schemas.openxmlformats.org/officeDocument/2006/relationships" xmlns:m="http://schemas.openxmlformats.org/officeDocument/2006/math" xmlns:v="urn:schemas-microsoft-com:vml" xmlns:wp14="http://schemas.microsoft.com/office/word/2010/wordprocessingDrawing" xmlns:wp="http://schemas.openxmlformats.org/drawingml/2006/wordprocessingDrawing" xmlns:w10="urn:schemas-microsoft-com:office:word" xmlns:w="http://schemas.openxmlformats.org/wordprocessingml/2006/main" xmlns:w14="http://schemas.microsoft.com/office/word/2010/wordml" xmlns:w15="http://schemas.microsoft.com/office/word/2012/wordml" xmlns:w16cex="http://schemas.microsoft.com/office/word/2018/wordml/cex" xmlns:w16cid="http://schemas.microsoft.com/office/word/2016/wordml/cid" xmlns:w16="http://schemas.microsoft.com/office/word/2018/wordml" xmlns:w16du="http://schemas.microsoft.com/office/word/2023/wordml/word16du" xmlns:w16sdtdh="http://schemas.microsoft.com/office/word/2020/wordml/sdtdatahash" xmlns:w16sdtfl="http://schemas.microsoft.com/office/word/2024/wordml/sdtformatlock" xmlns:w16se="http://schemas.microsoft.com/office/word/2015/wordml/symex" xmlns:wpg="http://schemas.microsoft.com/office/word/2010/wordprocessingGroup" xmlns:wpi="http://schemas.microsoft.com/office/word/2010/wordprocessingInk" xmlns:wne="http://schemas.microsoft.com/office/word/2006/wordml" xmlns:wps="http://schemas.microsoft.com/office/word/2010/wordprocessingShape" mc:Ignorable="w14 w15 w16se w16cid w16 w16cex w16sdtdh w16sdtfl cr w16du wp14">
-  <w16cex:commentExtensible w16cex:durableId="26F37873" w16cex:dateUtc="2026-03-01T18:30:00Z"/>
-  <w16cex:commentExtensible w16cex:durableId="145AAAAC" w16cex:dateUtc="2026-03-02T21:01:00Z"/>
-  <w16cex:commentExtensible w16cex:durableId="75F97230" w16cex:dateUtc="2026-03-01T18:36:00Z"/>
-  <w16cex:commentExtensible w16cex:durableId="651ECEB8" w16cex:dateUtc="2026-03-01T18:47:00Z"/>
-  <w16cex:commentExtensible w16cex:durableId="1B55BB2D" w16cex:dateUtc="2026-03-01T18:47:00Z"/>
-  <w16cex:commentExtensible w16cex:durableId="295BA72F" w16cex:dateUtc="2026-03-01T18:50:00Z"/>
-</w16cex:commentsExtensible>
-</file>
-
-<file path=word/commentsIds.xml><?xml version="1.0" encoding="utf-8"?>
-<w16cid:commentsIds xmlns:wpc="http://schemas.microsoft.com/office/word/2010/wordprocessingCanvas" xmlns:cx="http://schemas.microsoft.com/office/drawing/2014/chartex" xmlns:cx1="http://schemas.microsoft.com/office/drawing/2015/9/8/chartex" xmlns:cx2="http://schemas.microsoft.com/office/drawing/2015/10/21/chartex" xmlns:cx3="http://schemas.microsoft.com/office/drawing/2016/5/9/chartex" xmlns:cx4="http://schemas.microsoft.com/office/drawing/2016/5/10/chartex" xmlns:cx5="http://schemas.microsoft.com/office/drawing/2016/5/11/chartex" xmlns:cx6="http://schemas.microsoft.com/office/drawing/2016/5/12/chartex" xmlns:cx7="http://schemas.microsoft.com/office/drawing/2016/5/13/chartex" xmlns:cx8="http://schemas.microsoft.com/office/drawing/2016/5/14/chartex" xmlns:mc="http://schemas.openxmlformats.org/markup-compatibility/2006" xmlns:aink="http://schemas.microsoft.com/office/drawing/2016/ink" xmlns:am3d="http://schemas.microsoft.com/office/drawing/2017/model3d" xmlns:o="urn:schemas-microsoft-com:office:office" xmlns:oel="http://schemas.microsoft.com/office/2019/extlst" xmlns:r="http://schemas.openxmlformats.org/officeDocument/2006/relationships" xmlns:m="http://schemas.openxmlformats.org/officeDocument/2006/math" xmlns:v="urn:schemas-microsoft-com:vml" xmlns:wp14="http://schemas.microsoft.com/office/word/2010/wordprocessingDrawing" xmlns:wp="http://schemas.openxmlformats.org/drawingml/2006/wordprocessingDrawing" xmlns:w10="urn:schemas-microsoft-com:office:word" xmlns:w="http://schemas.openxmlformats.org/wordprocessingml/2006/main" xmlns:w14="http://schemas.microsoft.com/office/word/2010/wordml" xmlns:w15="http://schemas.microsoft.com/office/word/2012/wordml" xmlns:w16cex="http://schemas.microsoft.com/office/word/2018/wordml/cex" xmlns:w16cid="http://schemas.microsoft.com/office/word/2016/wordml/cid" xmlns:w16="http://schemas.microsoft.com/office/word/2018/wordml" xmlns:w16du="http://schemas.microsoft.com/office/word/2023/wordml/word16du" xmlns:w16sdtdh="http://schemas.microsoft.com/office/word/2020/wordml/sdtdatahash" xmlns:w16sdtfl="http://schemas.microsoft.com/office/word/2024/wordml/sdtformatlock" xmlns:w16se="http://schemas.microsoft.com/office/word/2015/wordml/symex" xmlns:wpg="http://schemas.microsoft.com/office/word/2010/wordprocessingGroup" xmlns:wpi="http://schemas.microsoft.com/office/word/2010/wordprocessingInk" xmlns:wne="http://schemas.microsoft.com/office/word/2006/wordml" xmlns:wps="http://schemas.microsoft.com/office/word/2010/wordprocessingShape" mc:Ignorable="w14 w15 w16se w16cid w16 w16cex w16sdtdh w16sdtfl w16du wp14">
-  <w16cid:commentId w16cid:paraId="1A1E0A7F" w16cid:durableId="26F37873"/>
-  <w16cid:commentId w16cid:paraId="03991202" w16cid:durableId="145AAAAC"/>
-  <w16cid:commentId w16cid:paraId="2622A8B1" w16cid:durableId="75F97230"/>
-  <w16cid:commentId w16cid:paraId="561FD940" w16cid:durableId="651ECEB8"/>
-  <w16cid:commentId w16cid:paraId="457B1378" w16cid:durableId="1B55BB2D"/>
-  <w16cid:commentId w16cid:paraId="4A5F42FA" w16cid:durableId="295BA72F"/>
-</w16cid:commentsIds>
-</file>
-
-<file path=word/people.xml><?xml version="1.0" encoding="utf-8"?>
-<w15:people xmlns:wpc="http://schemas.microsoft.com/office/word/2010/wordprocessingCanvas" xmlns:cx="http://schemas.microsoft.com/office/drawing/2014/chartex" xmlns:cx1="http://schemas.microsoft.com/office/drawing/2015/9/8/chartex" xmlns:cx2="http://schemas.microsoft.com/office/drawing/2015/10/21/chartex" xmlns:cx3="http://schemas.microsoft.com/office/drawing/2016/5/9/chartex" xmlns:cx4="http://schemas.microsoft.com/office/drawing/2016/5/10/chartex" xmlns:cx5="http://schemas.microsoft.com/office/drawing/2016/5/11/chartex" xmlns:cx6="http://schemas.microsoft.com/office/drawing/2016/5/12/chartex" xmlns:cx7="http://schemas.microsoft.com/office/drawing/2016/5/13/chartex" xmlns:cx8="http://schemas.microsoft.com/office/drawing/2016/5/14/chartex" xmlns:mc="http://schemas.openxmlformats.org/markup-compatibility/2006" xmlns:aink="http://schemas.microsoft.com/office/drawing/2016/ink" xmlns:am3d="http://schemas.microsoft.com/office/drawing/2017/model3d" xmlns:o="urn:schemas-microsoft-com:office:office" xmlns:oel="http://schemas.microsoft.com/office/2019/extlst" xmlns:r="http://schemas.openxmlformats.org/officeDocument/2006/relationships" xmlns:m="http://schemas.openxmlformats.org/officeDocument/2006/math" xmlns:v="urn:schemas-microsoft-com:vml" xmlns:wp14="http://schemas.microsoft.com/office/word/2010/wordprocessingDrawing" xmlns:wp="http://schemas.openxmlformats.org/drawingml/2006/wordprocessingDrawing" xmlns:w10="urn:schemas-microsoft-com:office:word" xmlns:w="http://schemas.openxmlformats.org/wordprocessingml/2006/main" xmlns:w14="http://schemas.microsoft.com/office/word/2010/wordml" xmlns:w15="http://schemas.microsoft.com/office/word/2012/wordml" xmlns:w16cex="http://schemas.microsoft.com/office/word/2018/wordml/cex" xmlns:w16cid="http://schemas.microsoft.com/office/word/2016/wordml/cid" xmlns:w16="http://schemas.microsoft.com/office/word/2018/wordml" xmlns:w16du="http://schemas.microsoft.com/office/word/2023/wordml/word16du" xmlns:w16sdtdh="http://schemas.microsoft.com/office/word/2020/wordml/sdtdatahash" xmlns:w16sdtfl="http://schemas.microsoft.com/office/word/2024/wordml/sdtformatlock" xmlns:w16se="http://schemas.microsoft.com/office/word/2015/wordml/symex" xmlns:wpg="http://schemas.microsoft.com/office/word/2010/wordprocessingGroup" xmlns:wpi="http://schemas.microsoft.com/office/word/2010/wordprocessingInk" xmlns:wne="http://schemas.microsoft.com/office/word/2006/wordml" xmlns:wps="http://schemas.microsoft.com/office/word/2010/wordprocessingShape" mc:Ignorable="w14 w15 w16se w16cid w16 w16cex w16sdtdh w16sdtfl w16du wp14">
-  <w15:person w15:author="Daniel Baker">
-    <w15:presenceInfo w15:providerId="AD" w15:userId="S::daniel.baker@york.ac.uk::33387a97-54af-41e1-812a-a022745ab039"/>
-  </w15:person>
-  <w15:person w15:author="Bruno Richard">
-    <w15:presenceInfo w15:providerId="AD" w15:userId="S::br379@newark.rutgers.edu::446afe87-5807-4f0f-af85-beca966d3188"/>
-  </w15:person>
-</w15:people>
 </file>
 
 <file path=word/styles.xml><?xml version="1.0" encoding="utf-8"?>

</xml_diff>

<commit_message>
Updated responses to reviewers
</commit_message>
<xml_diff>
--- a/Revisions Round 2/Response to reviewers 2_DHB.docx
+++ b/Revisions Round 2/Response to reviewers 2_DHB.docx
@@ -1387,7 +1387,21 @@
           <w:rFonts w:ascii="Aptos" w:hAnsi="Aptos"/>
           <w:color w:val="0F9ED5" w:themeColor="accent4"/>
         </w:rPr>
-        <w:t>To make this point clear, we have made the following amendments to our manuscript. In the introduction, when speaking about the computational descriptions of binocular summation we have included:</w:t>
+        <w:t>To make this point clear, we have made the following amendments to our manuscript. In the introduction, when speaking about the computational descriptions of binocular summation</w:t>
+      </w:r>
+      <w:r>
+        <w:rPr>
+          <w:rFonts w:ascii="Aptos" w:hAnsi="Aptos"/>
+          <w:color w:val="0F9ED5" w:themeColor="accent4"/>
+        </w:rPr>
+        <w:t>,</w:t>
+      </w:r>
+      <w:r>
+        <w:rPr>
+          <w:rFonts w:ascii="Aptos" w:hAnsi="Aptos"/>
+          <w:color w:val="0F9ED5" w:themeColor="accent4"/>
+        </w:rPr>
+        <w:t xml:space="preserve"> we have included:</w:t>
       </w:r>
     </w:p>
     <w:p>
@@ -2889,7 +2903,7 @@
         <w:rPr>
           <w:color w:val="EE0000"/>
         </w:rPr>
-        <w:t xml:space="preserve">Contrast sensitivity improves by a factor of at least </w:t>
+        <w:t xml:space="preserve">Contrast sensitivity improves by at least </w:t>
       </w:r>
       <w:r>
         <w:t xml:space="preserve">√2 </w:t>
@@ -2898,7 +2912,19 @@
         <w:rPr>
           <w:color w:val="EE0000"/>
         </w:rPr>
-        <w:t>when stimuli are presented binocularly versus monocularly</w:t>
+        <w:t xml:space="preserve">when stimuli are presented binocularly </w:t>
+      </w:r>
+      <w:r>
+        <w:rPr>
+          <w:color w:val="EE0000"/>
+        </w:rPr>
+        <w:t>rather than</w:t>
+      </w:r>
+      <w:r>
+        <w:rPr>
+          <w:color w:val="EE0000"/>
+        </w:rPr>
+        <w:t xml:space="preserve"> monocularly</w:t>
       </w:r>
       <w:r>
         <w:rPr>

</xml_diff>